<commit_message>
Amélioration code et rédaction rapport
</commit_message>
<xml_diff>
--- a/docs/R-Secured_Webshop-EmiKrasniqi-Rapport.docx
+++ b/docs/R-Secured_Webshop-EmiKrasniqi-Rapport.docx
@@ -6,7 +6,7 @@
       <w:pPr>
         <w:pStyle w:val="Titre1"/>
       </w:pPr>
-      <w:bookmarkStart w:id="0" w:name="_Toc188950850"/>
+      <w:bookmarkStart w:id="0" w:name="_Toc192509014"/>
       <w:r>
         <w:t>S</w:t>
       </w:r>
@@ -278,7 +278,7 @@
           <w:sz w:val="18"/>
           <w:szCs w:val="18"/>
         </w:rPr>
-        <w:t>2</w:t>
+        <w:t>10</w:t>
       </w:r>
       <w:r>
         <w:rPr>
@@ -290,7 +290,7 @@
           <w:sz w:val="18"/>
           <w:szCs w:val="18"/>
         </w:rPr>
-        <w:t>8</w:t>
+        <w:t>.</w:t>
       </w:r>
       <w:r>
         <w:rPr>
@@ -302,7 +302,7 @@
           <w:sz w:val="18"/>
           <w:szCs w:val="18"/>
         </w:rPr>
-        <w:t>.</w:t>
+        <w:t>0</w:t>
       </w:r>
       <w:r>
         <w:rPr>
@@ -314,7 +314,7 @@
           <w:sz w:val="18"/>
           <w:szCs w:val="18"/>
         </w:rPr>
-        <w:t>01</w:t>
+        <w:t>3</w:t>
       </w:r>
       <w:r>
         <w:rPr>
@@ -341,7 +341,7 @@
         <w:t>2025</w:t>
       </w:r>
     </w:p>
-    <w:bookmarkStart w:id="1" w:name="_Toc188950851" w:displacedByCustomXml="next"/>
+    <w:bookmarkStart w:id="1" w:name="_Toc192509015" w:displacedByCustomXml="next"/>
     <w:sdt>
       <w:sdtPr>
         <w:rPr>
@@ -406,7 +406,7 @@
           <w:r>
             <w:fldChar w:fldCharType="separate"/>
           </w:r>
-          <w:hyperlink w:anchor="_Toc188950850" w:history="1">
+          <w:hyperlink w:anchor="_Toc192509014" w:history="1">
             <w:r>
               <w:rPr>
                 <w:rStyle w:val="Lienhypertexte"/>
@@ -434,7 +434,7 @@
                 <w:noProof/>
                 <w:webHidden/>
               </w:rPr>
-              <w:instrText xml:space="preserve"> PAGEREF _Toc188950850 \h </w:instrText>
+              <w:instrText xml:space="preserve"> PAGEREF _Toc192509014 \h </w:instrText>
             </w:r>
             <w:r>
               <w:rPr>
@@ -481,7 +481,7 @@
               <w14:ligatures w14:val="standardContextual"/>
             </w:rPr>
           </w:pPr>
-          <w:hyperlink w:anchor="_Toc188950851" w:history="1">
+          <w:hyperlink w:anchor="_Toc192509015" w:history="1">
             <w:r>
               <w:rPr>
                 <w:rStyle w:val="Lienhypertexte"/>
@@ -509,7 +509,7 @@
                 <w:noProof/>
                 <w:webHidden/>
               </w:rPr>
-              <w:instrText xml:space="preserve"> PAGEREF _Toc188950851 \h </w:instrText>
+              <w:instrText xml:space="preserve"> PAGEREF _Toc192509015 \h </w:instrText>
             </w:r>
             <w:r>
               <w:rPr>
@@ -556,7 +556,7 @@
               <w14:ligatures w14:val="standardContextual"/>
             </w:rPr>
           </w:pPr>
-          <w:hyperlink w:anchor="_Toc188950852" w:history="1">
+          <w:hyperlink w:anchor="_Toc192509016" w:history="1">
             <w:r>
               <w:rPr>
                 <w:rStyle w:val="Lienhypertexte"/>
@@ -584,7 +584,7 @@
                 <w:noProof/>
                 <w:webHidden/>
               </w:rPr>
-              <w:instrText xml:space="preserve"> PAGEREF _Toc188950852 \h </w:instrText>
+              <w:instrText xml:space="preserve"> PAGEREF _Toc192509016 \h </w:instrText>
             </w:r>
             <w:r>
               <w:rPr>
@@ -632,7 +632,7 @@
               <w14:ligatures w14:val="standardContextual"/>
             </w:rPr>
           </w:pPr>
-          <w:hyperlink w:anchor="_Toc188950853" w:history="1">
+          <w:hyperlink w:anchor="_Toc192509017" w:history="1">
             <w:r>
               <w:rPr>
                 <w:rStyle w:val="Lienhypertexte"/>
@@ -682,7 +682,7 @@
                 <w:noProof/>
                 <w:webHidden/>
               </w:rPr>
-              <w:instrText xml:space="preserve"> PAGEREF _Toc188950853 \h </w:instrText>
+              <w:instrText xml:space="preserve"> PAGEREF _Toc192509017 \h </w:instrText>
             </w:r>
             <w:r>
               <w:rPr>
@@ -730,7 +730,7 @@
               <w14:ligatures w14:val="standardContextual"/>
             </w:rPr>
           </w:pPr>
-          <w:hyperlink w:anchor="_Toc188950854" w:history="1">
+          <w:hyperlink w:anchor="_Toc192509018" w:history="1">
             <w:r>
               <w:rPr>
                 <w:rStyle w:val="Lienhypertexte"/>
@@ -780,7 +780,7 @@
                 <w:noProof/>
                 <w:webHidden/>
               </w:rPr>
-              <w:instrText xml:space="preserve"> PAGEREF _Toc188950854 \h </w:instrText>
+              <w:instrText xml:space="preserve"> PAGEREF _Toc192509018 \h </w:instrText>
             </w:r>
             <w:r>
               <w:rPr>
@@ -828,7 +828,7 @@
               <w14:ligatures w14:val="standardContextual"/>
             </w:rPr>
           </w:pPr>
-          <w:hyperlink w:anchor="_Toc188950855" w:history="1">
+          <w:hyperlink w:anchor="_Toc192509019" w:history="1">
             <w:r>
               <w:rPr>
                 <w:rStyle w:val="Lienhypertexte"/>
@@ -878,7 +878,7 @@
                 <w:noProof/>
                 <w:webHidden/>
               </w:rPr>
-              <w:instrText xml:space="preserve"> PAGEREF _Toc188950855 \h </w:instrText>
+              <w:instrText xml:space="preserve"> PAGEREF _Toc192509019 \h </w:instrText>
             </w:r>
             <w:r>
               <w:rPr>
@@ -925,7 +925,7 @@
               <w14:ligatures w14:val="standardContextual"/>
             </w:rPr>
           </w:pPr>
-          <w:hyperlink w:anchor="_Toc188950856" w:history="1">
+          <w:hyperlink w:anchor="_Toc192509020" w:history="1">
             <w:r>
               <w:rPr>
                 <w:rStyle w:val="Lienhypertexte"/>
@@ -953,7 +953,7 @@
                 <w:noProof/>
                 <w:webHidden/>
               </w:rPr>
-              <w:instrText xml:space="preserve"> PAGEREF _Toc188950856 \h </w:instrText>
+              <w:instrText xml:space="preserve"> PAGEREF _Toc192509020 \h </w:instrText>
             </w:r>
             <w:r>
               <w:rPr>
@@ -974,81 +974,6 @@
                 <w:webHidden/>
               </w:rPr>
               <w:t>4</w:t>
-            </w:r>
-            <w:r>
-              <w:rPr>
-                <w:noProof/>
-                <w:webHidden/>
-              </w:rPr>
-              <w:fldChar w:fldCharType="end"/>
-            </w:r>
-          </w:hyperlink>
-        </w:p>
-        <w:p>
-          <w:pPr>
-            <w:pStyle w:val="TM2"/>
-            <w:tabs>
-              <w:tab w:val="right" w:leader="dot" w:pos="9062"/>
-            </w:tabs>
-            <w:rPr>
-              <w:rFonts w:asciiTheme="minorHAnsi" w:eastAsiaTheme="minorEastAsia" w:hAnsiTheme="minorHAnsi" w:cstheme="minorBidi"/>
-              <w:noProof/>
-              <w:kern w:val="2"/>
-              <w:sz w:val="22"/>
-              <w:szCs w:val="22"/>
-              <w:lang w:eastAsia="fr-CH"/>
-              <w14:ligatures w14:val="standardContextual"/>
-            </w:rPr>
-          </w:pPr>
-          <w:hyperlink w:anchor="_Toc188950857" w:history="1">
-            <w:r>
-              <w:rPr>
-                <w:rStyle w:val="Lienhypertexte"/>
-                <w:rFonts w:eastAsiaTheme="majorEastAsia"/>
-                <w:noProof/>
-              </w:rPr>
-              <w:t>Explication code</w:t>
-            </w:r>
-            <w:r>
-              <w:rPr>
-                <w:noProof/>
-                <w:webHidden/>
-              </w:rPr>
-              <w:tab/>
-            </w:r>
-            <w:r>
-              <w:rPr>
-                <w:noProof/>
-                <w:webHidden/>
-              </w:rPr>
-              <w:fldChar w:fldCharType="begin"/>
-            </w:r>
-            <w:r>
-              <w:rPr>
-                <w:noProof/>
-                <w:webHidden/>
-              </w:rPr>
-              <w:instrText xml:space="preserve"> PAGEREF _Toc188950857 \h </w:instrText>
-            </w:r>
-            <w:r>
-              <w:rPr>
-                <w:noProof/>
-                <w:webHidden/>
-              </w:rPr>
-            </w:r>
-            <w:r>
-              <w:rPr>
-                <w:noProof/>
-                <w:webHidden/>
-              </w:rPr>
-              <w:fldChar w:fldCharType="separate"/>
-            </w:r>
-            <w:r>
-              <w:rPr>
-                <w:noProof/>
-                <w:webHidden/>
-              </w:rPr>
-              <w:t>5</w:t>
             </w:r>
             <w:r>
               <w:rPr>
@@ -1076,7 +1001,7 @@
               <w14:ligatures w14:val="standardContextual"/>
             </w:rPr>
           </w:pPr>
-          <w:hyperlink w:anchor="_Toc188950858" w:history="1">
+          <w:hyperlink w:anchor="_Toc192509021" w:history="1">
             <w:r>
               <w:rPr>
                 <w:rStyle w:val="Lienhypertexte"/>
@@ -1105,7 +1030,7 @@
                 <w:noProof/>
                 <w:lang w:eastAsia="fr-CH"/>
               </w:rPr>
-              <w:t>Configuration OpenSSL</w:t>
+              <w:t>Client</w:t>
             </w:r>
             <w:r>
               <w:rPr>
@@ -1126,7 +1051,399 @@
                 <w:noProof/>
                 <w:webHidden/>
               </w:rPr>
-              <w:instrText xml:space="preserve"> PAGEREF _Toc188950858 \h </w:instrText>
+              <w:instrText xml:space="preserve"> PAGEREF _Toc192509021 \h </w:instrText>
+            </w:r>
+            <w:r>
+              <w:rPr>
+                <w:noProof/>
+                <w:webHidden/>
+              </w:rPr>
+            </w:r>
+            <w:r>
+              <w:rPr>
+                <w:noProof/>
+                <w:webHidden/>
+              </w:rPr>
+              <w:fldChar w:fldCharType="separate"/>
+            </w:r>
+            <w:r>
+              <w:rPr>
+                <w:noProof/>
+                <w:webHidden/>
+              </w:rPr>
+              <w:t>4</w:t>
+            </w:r>
+            <w:r>
+              <w:rPr>
+                <w:noProof/>
+                <w:webHidden/>
+              </w:rPr>
+              <w:fldChar w:fldCharType="end"/>
+            </w:r>
+          </w:hyperlink>
+        </w:p>
+        <w:p>
+          <w:pPr>
+            <w:pStyle w:val="TM3"/>
+            <w:tabs>
+              <w:tab w:val="left" w:pos="1100"/>
+              <w:tab w:val="right" w:leader="dot" w:pos="9062"/>
+            </w:tabs>
+            <w:rPr>
+              <w:rFonts w:asciiTheme="minorHAnsi" w:eastAsiaTheme="minorEastAsia" w:hAnsiTheme="minorHAnsi" w:cstheme="minorBidi"/>
+              <w:noProof/>
+              <w:kern w:val="2"/>
+              <w:sz w:val="22"/>
+              <w:szCs w:val="22"/>
+              <w:lang w:eastAsia="fr-CH"/>
+              <w14:ligatures w14:val="standardContextual"/>
+            </w:rPr>
+          </w:pPr>
+          <w:hyperlink w:anchor="_Toc192509022" w:history="1">
+            <w:r>
+              <w:rPr>
+                <w:rStyle w:val="Lienhypertexte"/>
+                <w:rFonts w:eastAsiaTheme="majorEastAsia"/>
+                <w:noProof/>
+                <w:lang w:eastAsia="fr-CH"/>
+              </w:rPr>
+              <w:t>II.</w:t>
+            </w:r>
+            <w:r>
+              <w:rPr>
+                <w:rFonts w:asciiTheme="minorHAnsi" w:eastAsiaTheme="minorEastAsia" w:hAnsiTheme="minorHAnsi" w:cstheme="minorBidi"/>
+                <w:noProof/>
+                <w:kern w:val="2"/>
+                <w:sz w:val="22"/>
+                <w:szCs w:val="22"/>
+                <w:lang w:eastAsia="fr-CH"/>
+                <w14:ligatures w14:val="standardContextual"/>
+              </w:rPr>
+              <w:tab/>
+            </w:r>
+            <w:r>
+              <w:rPr>
+                <w:rStyle w:val="Lienhypertexte"/>
+                <w:rFonts w:eastAsiaTheme="majorEastAsia"/>
+                <w:noProof/>
+                <w:lang w:eastAsia="fr-CH"/>
+              </w:rPr>
+              <w:t>Serveur</w:t>
+            </w:r>
+            <w:r>
+              <w:rPr>
+                <w:noProof/>
+                <w:webHidden/>
+              </w:rPr>
+              <w:tab/>
+            </w:r>
+            <w:r>
+              <w:rPr>
+                <w:noProof/>
+                <w:webHidden/>
+              </w:rPr>
+              <w:fldChar w:fldCharType="begin"/>
+            </w:r>
+            <w:r>
+              <w:rPr>
+                <w:noProof/>
+                <w:webHidden/>
+              </w:rPr>
+              <w:instrText xml:space="preserve"> PAGEREF _Toc192509022 \h </w:instrText>
+            </w:r>
+            <w:r>
+              <w:rPr>
+                <w:noProof/>
+                <w:webHidden/>
+              </w:rPr>
+            </w:r>
+            <w:r>
+              <w:rPr>
+                <w:noProof/>
+                <w:webHidden/>
+              </w:rPr>
+              <w:fldChar w:fldCharType="separate"/>
+            </w:r>
+            <w:r>
+              <w:rPr>
+                <w:noProof/>
+                <w:webHidden/>
+              </w:rPr>
+              <w:t>4</w:t>
+            </w:r>
+            <w:r>
+              <w:rPr>
+                <w:noProof/>
+                <w:webHidden/>
+              </w:rPr>
+              <w:fldChar w:fldCharType="end"/>
+            </w:r>
+          </w:hyperlink>
+        </w:p>
+        <w:p>
+          <w:pPr>
+            <w:pStyle w:val="TM3"/>
+            <w:tabs>
+              <w:tab w:val="left" w:pos="1100"/>
+              <w:tab w:val="right" w:leader="dot" w:pos="9062"/>
+            </w:tabs>
+            <w:rPr>
+              <w:rFonts w:asciiTheme="minorHAnsi" w:eastAsiaTheme="minorEastAsia" w:hAnsiTheme="minorHAnsi" w:cstheme="minorBidi"/>
+              <w:noProof/>
+              <w:kern w:val="2"/>
+              <w:sz w:val="22"/>
+              <w:szCs w:val="22"/>
+              <w:lang w:eastAsia="fr-CH"/>
+              <w14:ligatures w14:val="standardContextual"/>
+            </w:rPr>
+          </w:pPr>
+          <w:hyperlink w:anchor="_Toc192509023" w:history="1">
+            <w:r>
+              <w:rPr>
+                <w:rStyle w:val="Lienhypertexte"/>
+                <w:rFonts w:eastAsiaTheme="majorEastAsia"/>
+                <w:noProof/>
+                <w:lang w:eastAsia="fr-CH"/>
+              </w:rPr>
+              <w:t>III.</w:t>
+            </w:r>
+            <w:r>
+              <w:rPr>
+                <w:rFonts w:asciiTheme="minorHAnsi" w:eastAsiaTheme="minorEastAsia" w:hAnsiTheme="minorHAnsi" w:cstheme="minorBidi"/>
+                <w:noProof/>
+                <w:kern w:val="2"/>
+                <w:sz w:val="22"/>
+                <w:szCs w:val="22"/>
+                <w:lang w:eastAsia="fr-CH"/>
+                <w14:ligatures w14:val="standardContextual"/>
+              </w:rPr>
+              <w:tab/>
+            </w:r>
+            <w:r>
+              <w:rPr>
+                <w:rStyle w:val="Lienhypertexte"/>
+                <w:rFonts w:eastAsiaTheme="majorEastAsia"/>
+                <w:noProof/>
+                <w:lang w:eastAsia="fr-CH"/>
+              </w:rPr>
+              <w:t>Base de données</w:t>
+            </w:r>
+            <w:r>
+              <w:rPr>
+                <w:noProof/>
+                <w:webHidden/>
+              </w:rPr>
+              <w:tab/>
+            </w:r>
+            <w:r>
+              <w:rPr>
+                <w:noProof/>
+                <w:webHidden/>
+              </w:rPr>
+              <w:fldChar w:fldCharType="begin"/>
+            </w:r>
+            <w:r>
+              <w:rPr>
+                <w:noProof/>
+                <w:webHidden/>
+              </w:rPr>
+              <w:instrText xml:space="preserve"> PAGEREF _Toc192509023 \h </w:instrText>
+            </w:r>
+            <w:r>
+              <w:rPr>
+                <w:noProof/>
+                <w:webHidden/>
+              </w:rPr>
+            </w:r>
+            <w:r>
+              <w:rPr>
+                <w:noProof/>
+                <w:webHidden/>
+              </w:rPr>
+              <w:fldChar w:fldCharType="separate"/>
+            </w:r>
+            <w:r>
+              <w:rPr>
+                <w:noProof/>
+                <w:webHidden/>
+              </w:rPr>
+              <w:t>4</w:t>
+            </w:r>
+            <w:r>
+              <w:rPr>
+                <w:noProof/>
+                <w:webHidden/>
+              </w:rPr>
+              <w:fldChar w:fldCharType="end"/>
+            </w:r>
+          </w:hyperlink>
+        </w:p>
+        <w:p>
+          <w:pPr>
+            <w:pStyle w:val="TM3"/>
+            <w:tabs>
+              <w:tab w:val="left" w:pos="1100"/>
+              <w:tab w:val="right" w:leader="dot" w:pos="9062"/>
+            </w:tabs>
+            <w:rPr>
+              <w:rFonts w:asciiTheme="minorHAnsi" w:eastAsiaTheme="minorEastAsia" w:hAnsiTheme="minorHAnsi" w:cstheme="minorBidi"/>
+              <w:noProof/>
+              <w:kern w:val="2"/>
+              <w:sz w:val="22"/>
+              <w:szCs w:val="22"/>
+              <w:lang w:eastAsia="fr-CH"/>
+              <w14:ligatures w14:val="standardContextual"/>
+            </w:rPr>
+          </w:pPr>
+          <w:hyperlink w:anchor="_Toc192509024" w:history="1">
+            <w:r>
+              <w:rPr>
+                <w:rStyle w:val="Lienhypertexte"/>
+                <w:rFonts w:eastAsiaTheme="majorEastAsia"/>
+                <w:noProof/>
+                <w:lang w:eastAsia="fr-CH"/>
+              </w:rPr>
+              <w:t>IV.</w:t>
+            </w:r>
+            <w:r>
+              <w:rPr>
+                <w:rFonts w:asciiTheme="minorHAnsi" w:eastAsiaTheme="minorEastAsia" w:hAnsiTheme="minorHAnsi" w:cstheme="minorBidi"/>
+                <w:noProof/>
+                <w:kern w:val="2"/>
+                <w:sz w:val="22"/>
+                <w:szCs w:val="22"/>
+                <w:lang w:eastAsia="fr-CH"/>
+                <w14:ligatures w14:val="standardContextual"/>
+              </w:rPr>
+              <w:tab/>
+            </w:r>
+            <w:r>
+              <w:rPr>
+                <w:rStyle w:val="Lienhypertexte"/>
+                <w:rFonts w:eastAsiaTheme="majorEastAsia"/>
+                <w:noProof/>
+                <w:lang w:eastAsia="fr-CH"/>
+              </w:rPr>
+              <w:t>Sécurité</w:t>
+            </w:r>
+            <w:r>
+              <w:rPr>
+                <w:noProof/>
+                <w:webHidden/>
+              </w:rPr>
+              <w:tab/>
+            </w:r>
+            <w:r>
+              <w:rPr>
+                <w:noProof/>
+                <w:webHidden/>
+              </w:rPr>
+              <w:fldChar w:fldCharType="begin"/>
+            </w:r>
+            <w:r>
+              <w:rPr>
+                <w:noProof/>
+                <w:webHidden/>
+              </w:rPr>
+              <w:instrText xml:space="preserve"> PAGEREF _Toc192509024 \h </w:instrText>
+            </w:r>
+            <w:r>
+              <w:rPr>
+                <w:noProof/>
+                <w:webHidden/>
+              </w:rPr>
+            </w:r>
+            <w:r>
+              <w:rPr>
+                <w:noProof/>
+                <w:webHidden/>
+              </w:rPr>
+              <w:fldChar w:fldCharType="separate"/>
+            </w:r>
+            <w:r>
+              <w:rPr>
+                <w:noProof/>
+                <w:webHidden/>
+              </w:rPr>
+              <w:t>4</w:t>
+            </w:r>
+            <w:r>
+              <w:rPr>
+                <w:noProof/>
+                <w:webHidden/>
+              </w:rPr>
+              <w:fldChar w:fldCharType="end"/>
+            </w:r>
+          </w:hyperlink>
+        </w:p>
+        <w:p>
+          <w:pPr>
+            <w:pStyle w:val="TM3"/>
+            <w:tabs>
+              <w:tab w:val="left" w:pos="1100"/>
+              <w:tab w:val="right" w:leader="dot" w:pos="9062"/>
+            </w:tabs>
+            <w:rPr>
+              <w:rFonts w:asciiTheme="minorHAnsi" w:eastAsiaTheme="minorEastAsia" w:hAnsiTheme="minorHAnsi" w:cstheme="minorBidi"/>
+              <w:noProof/>
+              <w:kern w:val="2"/>
+              <w:sz w:val="22"/>
+              <w:szCs w:val="22"/>
+              <w:lang w:eastAsia="fr-CH"/>
+              <w14:ligatures w14:val="standardContextual"/>
+            </w:rPr>
+          </w:pPr>
+          <w:hyperlink w:anchor="_Toc192509025" w:history="1">
+            <w:r>
+              <w:rPr>
+                <w:rStyle w:val="Lienhypertexte"/>
+                <w:rFonts w:eastAsiaTheme="majorEastAsia"/>
+                <w:noProof/>
+                <w:lang w:eastAsia="fr-CH"/>
+              </w:rPr>
+              <w:t>V.</w:t>
+            </w:r>
+            <w:r>
+              <w:rPr>
+                <w:rFonts w:asciiTheme="minorHAnsi" w:eastAsiaTheme="minorEastAsia" w:hAnsiTheme="minorHAnsi" w:cstheme="minorBidi"/>
+                <w:noProof/>
+                <w:kern w:val="2"/>
+                <w:sz w:val="22"/>
+                <w:szCs w:val="22"/>
+                <w:lang w:eastAsia="fr-CH"/>
+                <w14:ligatures w14:val="standardContextual"/>
+              </w:rPr>
+              <w:tab/>
+            </w:r>
+            <w:r>
+              <w:rPr>
+                <w:rStyle w:val="Lienhypertexte"/>
+                <w:rFonts w:eastAsiaTheme="majorEastAsia"/>
+                <w:noProof/>
+                <w:lang w:eastAsia="fr-CH"/>
+              </w:rPr>
+              <w:t>Docker</w:t>
+            </w:r>
+            <w:r>
+              <w:rPr>
+                <w:noProof/>
+                <w:webHidden/>
+              </w:rPr>
+              <w:tab/>
+            </w:r>
+            <w:r>
+              <w:rPr>
+                <w:noProof/>
+                <w:webHidden/>
+              </w:rPr>
+              <w:fldChar w:fldCharType="begin"/>
+            </w:r>
+            <w:r>
+              <w:rPr>
+                <w:noProof/>
+                <w:webHidden/>
+              </w:rPr>
+              <w:instrText xml:space="preserve"> PAGEREF _Toc192509025 \h </w:instrText>
             </w:r>
             <w:r>
               <w:rPr>
@@ -1173,14 +1490,14 @@
               <w14:ligatures w14:val="standardContextual"/>
             </w:rPr>
           </w:pPr>
-          <w:hyperlink w:anchor="_Toc188950859" w:history="1">
+          <w:hyperlink w:anchor="_Toc192509026" w:history="1">
             <w:r>
               <w:rPr>
                 <w:rStyle w:val="Lienhypertexte"/>
                 <w:rFonts w:eastAsiaTheme="majorEastAsia"/>
                 <w:noProof/>
               </w:rPr>
-              <w:t>Conclusion</w:t>
+              <w:t>Explication code</w:t>
             </w:r>
             <w:r>
               <w:rPr>
@@ -1201,7 +1518,7 @@
                 <w:noProof/>
                 <w:webHidden/>
               </w:rPr>
-              <w:instrText xml:space="preserve"> PAGEREF _Toc188950859 \h </w:instrText>
+              <w:instrText xml:space="preserve"> PAGEREF _Toc192509026 \h </w:instrText>
             </w:r>
             <w:r>
               <w:rPr>
@@ -1249,7 +1566,7 @@
               <w14:ligatures w14:val="standardContextual"/>
             </w:rPr>
           </w:pPr>
-          <w:hyperlink w:anchor="_Toc188950860" w:history="1">
+          <w:hyperlink w:anchor="_Toc192509027" w:history="1">
             <w:r>
               <w:rPr>
                 <w:rStyle w:val="Lienhypertexte"/>
@@ -1278,7 +1595,7 @@
                 <w:noProof/>
                 <w:lang w:eastAsia="fr-CH"/>
               </w:rPr>
-              <w:t>Déroulement du projet</w:t>
+              <w:t>Configuration OpenSSL</w:t>
             </w:r>
             <w:r>
               <w:rPr>
@@ -1299,7 +1616,7 @@
                 <w:noProof/>
                 <w:webHidden/>
               </w:rPr>
-              <w:instrText xml:space="preserve"> PAGEREF _Toc188950860 \h </w:instrText>
+              <w:instrText xml:space="preserve"> PAGEREF _Toc192509027 \h </w:instrText>
             </w:r>
             <w:r>
               <w:rPr>
@@ -1347,7 +1664,7 @@
               <w14:ligatures w14:val="standardContextual"/>
             </w:rPr>
           </w:pPr>
-          <w:hyperlink w:anchor="_Toc188950861" w:history="1">
+          <w:hyperlink w:anchor="_Toc192509028" w:history="1">
             <w:r>
               <w:rPr>
                 <w:rStyle w:val="Lienhypertexte"/>
@@ -1376,7 +1693,7 @@
                 <w:noProof/>
                 <w:lang w:eastAsia="fr-CH"/>
               </w:rPr>
-              <w:t>Connaissances apprises</w:t>
+              <w:t>Gestion des utilisateurs</w:t>
             </w:r>
             <w:r>
               <w:rPr>
@@ -1397,7 +1714,7 @@
                 <w:noProof/>
                 <w:webHidden/>
               </w:rPr>
-              <w:instrText xml:space="preserve"> PAGEREF _Toc188950861 \h </w:instrText>
+              <w:instrText xml:space="preserve"> PAGEREF _Toc192509028 \h </w:instrText>
             </w:r>
             <w:r>
               <w:rPr>
@@ -1445,7 +1762,7 @@
               <w14:ligatures w14:val="standardContextual"/>
             </w:rPr>
           </w:pPr>
-          <w:hyperlink w:anchor="_Toc188950862" w:history="1">
+          <w:hyperlink w:anchor="_Toc192509029" w:history="1">
             <w:r>
               <w:rPr>
                 <w:rStyle w:val="Lienhypertexte"/>
@@ -1474,6 +1791,375 @@
                 <w:noProof/>
                 <w:lang w:eastAsia="fr-CH"/>
               </w:rPr>
+              <w:t>Implémentation EJS (HTML dynamique)</w:t>
+            </w:r>
+            <w:r>
+              <w:rPr>
+                <w:noProof/>
+                <w:webHidden/>
+              </w:rPr>
+              <w:tab/>
+            </w:r>
+            <w:r>
+              <w:rPr>
+                <w:noProof/>
+                <w:webHidden/>
+              </w:rPr>
+              <w:fldChar w:fldCharType="begin"/>
+            </w:r>
+            <w:r>
+              <w:rPr>
+                <w:noProof/>
+                <w:webHidden/>
+              </w:rPr>
+              <w:instrText xml:space="preserve"> PAGEREF _Toc192509029 \h </w:instrText>
+            </w:r>
+            <w:r>
+              <w:rPr>
+                <w:noProof/>
+                <w:webHidden/>
+              </w:rPr>
+            </w:r>
+            <w:r>
+              <w:rPr>
+                <w:noProof/>
+                <w:webHidden/>
+              </w:rPr>
+              <w:fldChar w:fldCharType="separate"/>
+            </w:r>
+            <w:r>
+              <w:rPr>
+                <w:noProof/>
+                <w:webHidden/>
+              </w:rPr>
+              <w:t>10</w:t>
+            </w:r>
+            <w:r>
+              <w:rPr>
+                <w:noProof/>
+                <w:webHidden/>
+              </w:rPr>
+              <w:fldChar w:fldCharType="end"/>
+            </w:r>
+          </w:hyperlink>
+        </w:p>
+        <w:p>
+          <w:pPr>
+            <w:pStyle w:val="TM2"/>
+            <w:tabs>
+              <w:tab w:val="right" w:leader="dot" w:pos="9062"/>
+            </w:tabs>
+            <w:rPr>
+              <w:rFonts w:asciiTheme="minorHAnsi" w:eastAsiaTheme="minorEastAsia" w:hAnsiTheme="minorHAnsi" w:cstheme="minorBidi"/>
+              <w:noProof/>
+              <w:kern w:val="2"/>
+              <w:sz w:val="22"/>
+              <w:szCs w:val="22"/>
+              <w:lang w:eastAsia="fr-CH"/>
+              <w14:ligatures w14:val="standardContextual"/>
+            </w:rPr>
+          </w:pPr>
+          <w:hyperlink w:anchor="_Toc192509030" w:history="1">
+            <w:r>
+              <w:rPr>
+                <w:rStyle w:val="Lienhypertexte"/>
+                <w:rFonts w:eastAsiaTheme="majorEastAsia"/>
+                <w:noProof/>
+              </w:rPr>
+              <w:t>Conclusion</w:t>
+            </w:r>
+            <w:r>
+              <w:rPr>
+                <w:noProof/>
+                <w:webHidden/>
+              </w:rPr>
+              <w:tab/>
+            </w:r>
+            <w:r>
+              <w:rPr>
+                <w:noProof/>
+                <w:webHidden/>
+              </w:rPr>
+              <w:fldChar w:fldCharType="begin"/>
+            </w:r>
+            <w:r>
+              <w:rPr>
+                <w:noProof/>
+                <w:webHidden/>
+              </w:rPr>
+              <w:instrText xml:space="preserve"> PAGEREF _Toc192509030 \h </w:instrText>
+            </w:r>
+            <w:r>
+              <w:rPr>
+                <w:noProof/>
+                <w:webHidden/>
+              </w:rPr>
+            </w:r>
+            <w:r>
+              <w:rPr>
+                <w:noProof/>
+                <w:webHidden/>
+              </w:rPr>
+              <w:fldChar w:fldCharType="separate"/>
+            </w:r>
+            <w:r>
+              <w:rPr>
+                <w:noProof/>
+                <w:webHidden/>
+              </w:rPr>
+              <w:t>11</w:t>
+            </w:r>
+            <w:r>
+              <w:rPr>
+                <w:noProof/>
+                <w:webHidden/>
+              </w:rPr>
+              <w:fldChar w:fldCharType="end"/>
+            </w:r>
+          </w:hyperlink>
+        </w:p>
+        <w:p>
+          <w:pPr>
+            <w:pStyle w:val="TM3"/>
+            <w:tabs>
+              <w:tab w:val="left" w:pos="880"/>
+              <w:tab w:val="right" w:leader="dot" w:pos="9062"/>
+            </w:tabs>
+            <w:rPr>
+              <w:rFonts w:asciiTheme="minorHAnsi" w:eastAsiaTheme="minorEastAsia" w:hAnsiTheme="minorHAnsi" w:cstheme="minorBidi"/>
+              <w:noProof/>
+              <w:kern w:val="2"/>
+              <w:sz w:val="22"/>
+              <w:szCs w:val="22"/>
+              <w:lang w:eastAsia="fr-CH"/>
+              <w14:ligatures w14:val="standardContextual"/>
+            </w:rPr>
+          </w:pPr>
+          <w:hyperlink w:anchor="_Toc192509031" w:history="1">
+            <w:r>
+              <w:rPr>
+                <w:rStyle w:val="Lienhypertexte"/>
+                <w:rFonts w:eastAsiaTheme="majorEastAsia"/>
+                <w:noProof/>
+                <w:lang w:eastAsia="fr-CH"/>
+              </w:rPr>
+              <w:t>I.</w:t>
+            </w:r>
+            <w:r>
+              <w:rPr>
+                <w:rFonts w:asciiTheme="minorHAnsi" w:eastAsiaTheme="minorEastAsia" w:hAnsiTheme="minorHAnsi" w:cstheme="minorBidi"/>
+                <w:noProof/>
+                <w:kern w:val="2"/>
+                <w:sz w:val="22"/>
+                <w:szCs w:val="22"/>
+                <w:lang w:eastAsia="fr-CH"/>
+                <w14:ligatures w14:val="standardContextual"/>
+              </w:rPr>
+              <w:tab/>
+            </w:r>
+            <w:r>
+              <w:rPr>
+                <w:rStyle w:val="Lienhypertexte"/>
+                <w:rFonts w:eastAsiaTheme="majorEastAsia"/>
+                <w:noProof/>
+                <w:lang w:eastAsia="fr-CH"/>
+              </w:rPr>
+              <w:t>Déroulement du projet</w:t>
+            </w:r>
+            <w:r>
+              <w:rPr>
+                <w:noProof/>
+                <w:webHidden/>
+              </w:rPr>
+              <w:tab/>
+            </w:r>
+            <w:r>
+              <w:rPr>
+                <w:noProof/>
+                <w:webHidden/>
+              </w:rPr>
+              <w:fldChar w:fldCharType="begin"/>
+            </w:r>
+            <w:r>
+              <w:rPr>
+                <w:noProof/>
+                <w:webHidden/>
+              </w:rPr>
+              <w:instrText xml:space="preserve"> PAGEREF _Toc192509031 \h </w:instrText>
+            </w:r>
+            <w:r>
+              <w:rPr>
+                <w:noProof/>
+                <w:webHidden/>
+              </w:rPr>
+            </w:r>
+            <w:r>
+              <w:rPr>
+                <w:noProof/>
+                <w:webHidden/>
+              </w:rPr>
+              <w:fldChar w:fldCharType="separate"/>
+            </w:r>
+            <w:r>
+              <w:rPr>
+                <w:noProof/>
+                <w:webHidden/>
+              </w:rPr>
+              <w:t>11</w:t>
+            </w:r>
+            <w:r>
+              <w:rPr>
+                <w:noProof/>
+                <w:webHidden/>
+              </w:rPr>
+              <w:fldChar w:fldCharType="end"/>
+            </w:r>
+          </w:hyperlink>
+        </w:p>
+        <w:p>
+          <w:pPr>
+            <w:pStyle w:val="TM3"/>
+            <w:tabs>
+              <w:tab w:val="left" w:pos="1100"/>
+              <w:tab w:val="right" w:leader="dot" w:pos="9062"/>
+            </w:tabs>
+            <w:rPr>
+              <w:rFonts w:asciiTheme="minorHAnsi" w:eastAsiaTheme="minorEastAsia" w:hAnsiTheme="minorHAnsi" w:cstheme="minorBidi"/>
+              <w:noProof/>
+              <w:kern w:val="2"/>
+              <w:sz w:val="22"/>
+              <w:szCs w:val="22"/>
+              <w:lang w:eastAsia="fr-CH"/>
+              <w14:ligatures w14:val="standardContextual"/>
+            </w:rPr>
+          </w:pPr>
+          <w:hyperlink w:anchor="_Toc192509032" w:history="1">
+            <w:r>
+              <w:rPr>
+                <w:rStyle w:val="Lienhypertexte"/>
+                <w:rFonts w:eastAsiaTheme="majorEastAsia"/>
+                <w:noProof/>
+                <w:lang w:eastAsia="fr-CH"/>
+              </w:rPr>
+              <w:t>II.</w:t>
+            </w:r>
+            <w:r>
+              <w:rPr>
+                <w:rFonts w:asciiTheme="minorHAnsi" w:eastAsiaTheme="minorEastAsia" w:hAnsiTheme="minorHAnsi" w:cstheme="minorBidi"/>
+                <w:noProof/>
+                <w:kern w:val="2"/>
+                <w:sz w:val="22"/>
+                <w:szCs w:val="22"/>
+                <w:lang w:eastAsia="fr-CH"/>
+                <w14:ligatures w14:val="standardContextual"/>
+              </w:rPr>
+              <w:tab/>
+            </w:r>
+            <w:r>
+              <w:rPr>
+                <w:rStyle w:val="Lienhypertexte"/>
+                <w:rFonts w:eastAsiaTheme="majorEastAsia"/>
+                <w:noProof/>
+                <w:lang w:eastAsia="fr-CH"/>
+              </w:rPr>
+              <w:t>Connaissances apprises</w:t>
+            </w:r>
+            <w:r>
+              <w:rPr>
+                <w:noProof/>
+                <w:webHidden/>
+              </w:rPr>
+              <w:tab/>
+            </w:r>
+            <w:r>
+              <w:rPr>
+                <w:noProof/>
+                <w:webHidden/>
+              </w:rPr>
+              <w:fldChar w:fldCharType="begin"/>
+            </w:r>
+            <w:r>
+              <w:rPr>
+                <w:noProof/>
+                <w:webHidden/>
+              </w:rPr>
+              <w:instrText xml:space="preserve"> PAGEREF _Toc192509032 \h </w:instrText>
+            </w:r>
+            <w:r>
+              <w:rPr>
+                <w:noProof/>
+                <w:webHidden/>
+              </w:rPr>
+            </w:r>
+            <w:r>
+              <w:rPr>
+                <w:noProof/>
+                <w:webHidden/>
+              </w:rPr>
+              <w:fldChar w:fldCharType="separate"/>
+            </w:r>
+            <w:r>
+              <w:rPr>
+                <w:noProof/>
+                <w:webHidden/>
+              </w:rPr>
+              <w:t>11</w:t>
+            </w:r>
+            <w:r>
+              <w:rPr>
+                <w:noProof/>
+                <w:webHidden/>
+              </w:rPr>
+              <w:fldChar w:fldCharType="end"/>
+            </w:r>
+          </w:hyperlink>
+        </w:p>
+        <w:p>
+          <w:pPr>
+            <w:pStyle w:val="TM3"/>
+            <w:tabs>
+              <w:tab w:val="left" w:pos="1100"/>
+              <w:tab w:val="right" w:leader="dot" w:pos="9062"/>
+            </w:tabs>
+            <w:rPr>
+              <w:rFonts w:asciiTheme="minorHAnsi" w:eastAsiaTheme="minorEastAsia" w:hAnsiTheme="minorHAnsi" w:cstheme="minorBidi"/>
+              <w:noProof/>
+              <w:kern w:val="2"/>
+              <w:sz w:val="22"/>
+              <w:szCs w:val="22"/>
+              <w:lang w:eastAsia="fr-CH"/>
+              <w14:ligatures w14:val="standardContextual"/>
+            </w:rPr>
+          </w:pPr>
+          <w:hyperlink w:anchor="_Toc192509033" w:history="1">
+            <w:r>
+              <w:rPr>
+                <w:rStyle w:val="Lienhypertexte"/>
+                <w:rFonts w:eastAsiaTheme="majorEastAsia"/>
+                <w:noProof/>
+                <w:lang w:eastAsia="fr-CH"/>
+              </w:rPr>
+              <w:t>III.</w:t>
+            </w:r>
+            <w:r>
+              <w:rPr>
+                <w:rFonts w:asciiTheme="minorHAnsi" w:eastAsiaTheme="minorEastAsia" w:hAnsiTheme="minorHAnsi" w:cstheme="minorBidi"/>
+                <w:noProof/>
+                <w:kern w:val="2"/>
+                <w:sz w:val="22"/>
+                <w:szCs w:val="22"/>
+                <w:lang w:eastAsia="fr-CH"/>
+                <w14:ligatures w14:val="standardContextual"/>
+              </w:rPr>
+              <w:tab/>
+            </w:r>
+            <w:r>
+              <w:rPr>
+                <w:rStyle w:val="Lienhypertexte"/>
+                <w:rFonts w:eastAsiaTheme="majorEastAsia"/>
+                <w:noProof/>
+                <w:lang w:eastAsia="fr-CH"/>
+              </w:rPr>
               <w:t>Points à améliorer</w:t>
             </w:r>
             <w:r>
@@ -1495,7 +2181,7 @@
                 <w:noProof/>
                 <w:webHidden/>
               </w:rPr>
-              <w:instrText xml:space="preserve"> PAGEREF _Toc188950862 \h </w:instrText>
+              <w:instrText xml:space="preserve"> PAGEREF _Toc192509033 \h </w:instrText>
             </w:r>
             <w:r>
               <w:rPr>
@@ -1515,7 +2201,7 @@
                 <w:noProof/>
                 <w:webHidden/>
               </w:rPr>
-              <w:t>6</w:t>
+              <w:t>11</w:t>
             </w:r>
             <w:r>
               <w:rPr>
@@ -1547,7 +2233,7 @@
       <w:pPr>
         <w:pStyle w:val="Titre2"/>
       </w:pPr>
-      <w:bookmarkStart w:id="2" w:name="_Toc188950852"/>
+      <w:bookmarkStart w:id="2" w:name="_Toc192509016"/>
       <w:r>
         <w:lastRenderedPageBreak/>
         <w:t>Mis en place des outils</w:t>
@@ -1561,7 +2247,7 @@
           <w:lang w:eastAsia="fr-CH"/>
         </w:rPr>
       </w:pPr>
-      <w:bookmarkStart w:id="3" w:name="_Toc188950853"/>
+      <w:bookmarkStart w:id="3" w:name="_Toc192509017"/>
       <w:r>
         <w:rPr>
           <w:lang w:eastAsia="fr-CH"/>
@@ -1644,7 +2330,7 @@
           <w:lang w:eastAsia="fr-CH"/>
         </w:rPr>
       </w:pPr>
-      <w:bookmarkStart w:id="4" w:name="_Toc188950854"/>
+      <w:bookmarkStart w:id="4" w:name="_Toc192509018"/>
       <w:r>
         <w:rPr>
           <w:lang w:eastAsia="fr-CH"/>
@@ -1844,7 +2530,7 @@
           <w:lang w:eastAsia="fr-CH"/>
         </w:rPr>
       </w:pPr>
-      <w:bookmarkStart w:id="5" w:name="_Toc188950855"/>
+      <w:bookmarkStart w:id="5" w:name="_Toc192509019"/>
       <w:r>
         <w:rPr>
           <w:lang w:eastAsia="fr-CH"/>
@@ -2053,7 +2739,7 @@
       <w:pPr>
         <w:pStyle w:val="Titre2"/>
       </w:pPr>
-      <w:bookmarkStart w:id="6" w:name="_Toc188950856"/>
+      <w:bookmarkStart w:id="6" w:name="_Toc192509020"/>
       <w:r>
         <w:lastRenderedPageBreak/>
         <w:t>Conceptualisation (schéma)</w:t>
@@ -2062,21 +2748,679 @@
     </w:p>
     <w:p>
       <w:pPr>
-        <w:rPr>
-          <w:lang w:eastAsia="fr-CH"/>
-        </w:rPr>
-      </w:pPr>
+        <w:jc w:val="center"/>
+        <w:rPr>
+          <w:lang w:eastAsia="fr-CH"/>
+        </w:rPr>
+      </w:pPr>
+      <w:r>
+        <w:rPr>
+          <w:lang w:eastAsia="fr-CH"/>
+        </w:rPr>
+        <w:drawing>
+          <wp:inline distT="0" distB="0" distL="0" distR="0" wp14:anchorId="27524C23" wp14:editId="46FB90AF">
+            <wp:extent cx="5760720" cy="975360"/>
+            <wp:effectExtent l="19050" t="19050" r="11430" b="15240"/>
+            <wp:docPr id="9" name="Image 9"/>
+            <wp:cNvGraphicFramePr>
+              <a:graphicFrameLocks xmlns:a="http://schemas.openxmlformats.org/drawingml/2006/main" noChangeAspect="1"/>
+            </wp:cNvGraphicFramePr>
+            <a:graphic xmlns:a="http://schemas.openxmlformats.org/drawingml/2006/main">
+              <a:graphicData uri="http://schemas.openxmlformats.org/drawingml/2006/picture">
+                <pic:pic xmlns:pic="http://schemas.openxmlformats.org/drawingml/2006/picture">
+                  <pic:nvPicPr>
+                    <pic:cNvPr id="1" name=""/>
+                    <pic:cNvPicPr/>
+                  </pic:nvPicPr>
+                  <pic:blipFill>
+                    <a:blip r:embed="rId18"/>
+                    <a:stretch>
+                      <a:fillRect/>
+                    </a:stretch>
+                  </pic:blipFill>
+                  <pic:spPr>
+                    <a:xfrm>
+                      <a:off x="0" y="0"/>
+                      <a:ext cx="5760720" cy="975360"/>
+                    </a:xfrm>
+                    <a:prstGeom prst="rect">
+                      <a:avLst/>
+                    </a:prstGeom>
+                    <a:ln>
+                      <a:solidFill>
+                        <a:schemeClr val="bg1">
+                          <a:lumMod val="75000"/>
+                        </a:schemeClr>
+                      </a:solidFill>
+                    </a:ln>
+                  </pic:spPr>
+                </pic:pic>
+              </a:graphicData>
+            </a:graphic>
+          </wp:inline>
+        </w:drawing>
+      </w:r>
+    </w:p>
+    <w:p>
+      <w:pPr>
+        <w:pStyle w:val="Titre3"/>
+        <w:numPr>
+          <w:ilvl w:val="0"/>
+          <w:numId w:val="17"/>
+        </w:numPr>
+        <w:rPr>
+          <w:lang w:eastAsia="fr-CH"/>
+        </w:rPr>
+      </w:pPr>
+      <w:bookmarkStart w:id="7" w:name="_Toc192509021"/>
+      <w:r>
+        <w:rPr>
+          <w:lang w:eastAsia="fr-CH"/>
+        </w:rPr>
+        <w:t>Client</w:t>
+      </w:r>
+      <w:bookmarkEnd w:id="7"/>
+    </w:p>
+    <w:p>
+      <w:pPr>
+        <w:rPr>
+          <w:lang w:eastAsia="fr-CH"/>
+        </w:rPr>
+      </w:pPr>
+      <w:r>
+        <w:rPr>
+          <w:lang w:eastAsia="fr-CH"/>
+        </w:rPr>
+        <w:t xml:space="preserve">Le client est l'interface utilisateur de </w:t>
+      </w:r>
+      <w:r>
+        <w:rPr>
+          <w:lang w:eastAsia="fr-CH"/>
+        </w:rPr>
+        <w:t>l’a</w:t>
+      </w:r>
+      <w:r>
+        <w:rPr>
+          <w:lang w:eastAsia="fr-CH"/>
+        </w:rPr>
+        <w:t xml:space="preserve">pplication. Il s'agit d'un navigateur web qui permet aux utilisateurs d'interagir avec </w:t>
+      </w:r>
+      <w:r>
+        <w:rPr>
+          <w:lang w:eastAsia="fr-CH"/>
+        </w:rPr>
+        <w:t>l’</w:t>
+      </w:r>
+      <w:r>
+        <w:rPr>
+          <w:lang w:eastAsia="fr-CH"/>
+        </w:rPr>
+        <w:t xml:space="preserve">application en envoyant des requêtes </w:t>
+      </w:r>
+      <w:r>
+        <w:rPr>
+          <w:i/>
+          <w:iCs/>
+          <w:lang w:eastAsia="fr-CH"/>
+        </w:rPr>
+        <w:t>HTTP</w:t>
+      </w:r>
+      <w:r>
+        <w:rPr>
+          <w:lang w:eastAsia="fr-CH"/>
+        </w:rPr>
+        <w:t xml:space="preserve"> au serveur.</w:t>
+      </w:r>
+    </w:p>
+    <w:p>
+      <w:pPr>
+        <w:pStyle w:val="Titre3"/>
+        <w:rPr>
+          <w:lang w:eastAsia="fr-CH"/>
+        </w:rPr>
+      </w:pPr>
+      <w:bookmarkStart w:id="8" w:name="_Toc192509022"/>
+      <w:r>
+        <w:rPr>
+          <w:lang w:eastAsia="fr-CH"/>
+        </w:rPr>
+        <w:t>Serveur</w:t>
+      </w:r>
+      <w:bookmarkEnd w:id="8"/>
+    </w:p>
+    <w:p>
+      <w:pPr>
+        <w:rPr>
+          <w:lang w:eastAsia="fr-CH"/>
+        </w:rPr>
+      </w:pPr>
+      <w:r>
+        <w:rPr>
+          <w:lang w:eastAsia="fr-CH"/>
+        </w:rPr>
+        <w:t>Le serveur est développé avec Node.js et Express. Il reçoit les requêtes du client, traite les données et renvoie les réponses appropriées. Le serveur est structuré en plusieurs parties :</w:t>
+      </w:r>
+    </w:p>
+    <w:p>
+      <w:pPr>
+        <w:pStyle w:val="Paragraphedeliste"/>
+        <w:numPr>
+          <w:ilvl w:val="0"/>
+          <w:numId w:val="18"/>
+        </w:numPr>
+        <w:rPr>
+          <w:lang w:eastAsia="fr-CH"/>
+        </w:rPr>
+      </w:pPr>
+      <w:r>
+        <w:rPr>
+          <w:b/>
+          <w:bCs/>
+          <w:lang w:eastAsia="fr-CH"/>
+        </w:rPr>
+        <w:t>Contrôleurs</w:t>
+      </w:r>
+      <w:r>
+        <w:rPr>
+          <w:lang w:eastAsia="fr-CH"/>
+        </w:rPr>
+        <w:t xml:space="preserve"> : Les contrôleurs, comme </w:t>
+      </w:r>
+      <w:r>
+        <w:rPr>
+          <w:lang w:eastAsia="fr-CH"/>
+        </w:rPr>
+        <w:t>« </w:t>
+      </w:r>
+      <w:r>
+        <w:rPr>
+          <w:i/>
+          <w:iCs/>
+          <w:lang w:eastAsia="fr-CH"/>
+        </w:rPr>
+        <w:t>userController.mjs</w:t>
+      </w:r>
+      <w:r>
+        <w:rPr>
+          <w:lang w:eastAsia="fr-CH"/>
+        </w:rPr>
+        <w:t> »</w:t>
+      </w:r>
+      <w:r>
+        <w:rPr>
+          <w:lang w:eastAsia="fr-CH"/>
+        </w:rPr>
+        <w:t>, contiennent la logique pour gérer les utilisateurs (inscription, connexion, recherche).</w:t>
+      </w:r>
+    </w:p>
+    <w:p>
+      <w:pPr>
+        <w:pStyle w:val="Paragraphedeliste"/>
+        <w:numPr>
+          <w:ilvl w:val="0"/>
+          <w:numId w:val="18"/>
+        </w:numPr>
+        <w:rPr>
+          <w:lang w:eastAsia="fr-CH"/>
+        </w:rPr>
+      </w:pPr>
+      <w:r>
+        <w:rPr>
+          <w:b/>
+          <w:bCs/>
+          <w:lang w:eastAsia="fr-CH"/>
+        </w:rPr>
+        <w:t>Middleware</w:t>
+      </w:r>
+      <w:r>
+        <w:rPr>
+          <w:lang w:eastAsia="fr-CH"/>
+        </w:rPr>
+        <w:t xml:space="preserve"> : Les </w:t>
+      </w:r>
+      <w:r>
+        <w:rPr>
+          <w:i/>
+          <w:iCs/>
+          <w:lang w:eastAsia="fr-CH"/>
+        </w:rPr>
+        <w:t>middlewares</w:t>
+      </w:r>
+      <w:r>
+        <w:rPr>
+          <w:lang w:eastAsia="fr-CH"/>
+        </w:rPr>
+        <w:t xml:space="preserve"> gèrent l'authentification et les redirections.</w:t>
+      </w:r>
+    </w:p>
+    <w:p>
+      <w:pPr>
+        <w:pStyle w:val="Paragraphedeliste"/>
+        <w:numPr>
+          <w:ilvl w:val="0"/>
+          <w:numId w:val="18"/>
+        </w:numPr>
+        <w:rPr>
+          <w:lang w:eastAsia="fr-CH"/>
+        </w:rPr>
+      </w:pPr>
+      <w:r>
+        <w:rPr>
+          <w:b/>
+          <w:bCs/>
+          <w:lang w:eastAsia="fr-CH"/>
+        </w:rPr>
+        <w:t>Routes</w:t>
+      </w:r>
+      <w:r>
+        <w:rPr>
+          <w:lang w:eastAsia="fr-CH"/>
+        </w:rPr>
+        <w:t xml:space="preserve"> : Les routes définissent les points d'entrée de l'application et mappent les </w:t>
+      </w:r>
+      <w:r>
+        <w:rPr>
+          <w:i/>
+          <w:iCs/>
+          <w:lang w:eastAsia="fr-CH"/>
+        </w:rPr>
+        <w:t>URL</w:t>
+      </w:r>
+      <w:r>
+        <w:rPr>
+          <w:lang w:eastAsia="fr-CH"/>
+        </w:rPr>
+        <w:t xml:space="preserve"> aux contrôleurs.</w:t>
+      </w:r>
+    </w:p>
+    <w:p>
+      <w:pPr>
+        <w:pStyle w:val="Paragraphedeliste"/>
+        <w:numPr>
+          <w:ilvl w:val="0"/>
+          <w:numId w:val="18"/>
+        </w:numPr>
+        <w:rPr>
+          <w:lang w:eastAsia="fr-CH"/>
+        </w:rPr>
+      </w:pPr>
+      <w:r>
+        <w:rPr>
+          <w:b/>
+          <w:bCs/>
+          <w:lang w:eastAsia="fr-CH"/>
+        </w:rPr>
+        <w:t>Vues</w:t>
+      </w:r>
+      <w:r>
+        <w:rPr>
+          <w:lang w:eastAsia="fr-CH"/>
+        </w:rPr>
+        <w:t xml:space="preserve"> : Les vues sont des </w:t>
+      </w:r>
+      <w:r>
+        <w:rPr>
+          <w:i/>
+          <w:iCs/>
+          <w:lang w:eastAsia="fr-CH"/>
+        </w:rPr>
+        <w:t>templates EJS</w:t>
+      </w:r>
+      <w:r>
+        <w:rPr>
+          <w:lang w:eastAsia="fr-CH"/>
+        </w:rPr>
+        <w:t xml:space="preserve"> qui génèrent le </w:t>
+      </w:r>
+      <w:r>
+        <w:rPr>
+          <w:i/>
+          <w:iCs/>
+          <w:lang w:eastAsia="fr-CH"/>
+        </w:rPr>
+        <w:t>HTML</w:t>
+      </w:r>
+      <w:r>
+        <w:rPr>
+          <w:lang w:eastAsia="fr-CH"/>
+        </w:rPr>
+        <w:t xml:space="preserve"> dynamique.</w:t>
+      </w:r>
+    </w:p>
+    <w:p>
+      <w:pPr>
+        <w:pStyle w:val="Titre3"/>
+        <w:rPr>
+          <w:lang w:eastAsia="fr-CH"/>
+        </w:rPr>
+      </w:pPr>
+      <w:bookmarkStart w:id="9" w:name="_Toc192509023"/>
+      <w:r>
+        <w:rPr>
+          <w:lang w:eastAsia="fr-CH"/>
+        </w:rPr>
+        <w:t>Base de données</w:t>
+      </w:r>
+      <w:bookmarkEnd w:id="9"/>
+    </w:p>
+    <w:p>
+      <w:pPr>
+        <w:rPr>
+          <w:lang w:eastAsia="fr-CH"/>
+        </w:rPr>
+      </w:pPr>
+      <w:r>
+        <w:rPr>
+          <w:lang w:eastAsia="fr-CH"/>
+        </w:rPr>
+        <w:t xml:space="preserve">La base de données est un serveur </w:t>
+      </w:r>
+      <w:r>
+        <w:rPr>
+          <w:i/>
+          <w:iCs/>
+          <w:lang w:eastAsia="fr-CH"/>
+        </w:rPr>
+        <w:t>MySQL</w:t>
+      </w:r>
+      <w:r>
+        <w:rPr>
+          <w:lang w:eastAsia="fr-CH"/>
+        </w:rPr>
+        <w:t xml:space="preserve">, géré via </w:t>
+      </w:r>
+      <w:r>
+        <w:rPr>
+          <w:i/>
+          <w:iCs/>
+          <w:lang w:eastAsia="fr-CH"/>
+        </w:rPr>
+        <w:t>Docker</w:t>
+      </w:r>
+      <w:r>
+        <w:rPr>
+          <w:lang w:eastAsia="fr-CH"/>
+        </w:rPr>
+        <w:t>. Elle stocke les informations des utilisateurs, comme les noms d'utilisateur, les mots de passe hachés et les rôles d'administrateur.</w:t>
+      </w:r>
+    </w:p>
+    <w:p>
+      <w:pPr>
+        <w:pStyle w:val="Titre3"/>
+        <w:rPr>
+          <w:lang w:eastAsia="fr-CH"/>
+        </w:rPr>
+      </w:pPr>
+      <w:bookmarkStart w:id="10" w:name="_Toc192509024"/>
+      <w:r>
+        <w:rPr>
+          <w:lang w:eastAsia="fr-CH"/>
+        </w:rPr>
+        <w:t>Sécurité</w:t>
+      </w:r>
+      <w:bookmarkEnd w:id="10"/>
+    </w:p>
+    <w:p>
+      <w:pPr>
+        <w:rPr>
+          <w:lang w:eastAsia="fr-CH"/>
+        </w:rPr>
+      </w:pPr>
+      <w:r>
+        <w:rPr>
+          <w:lang w:eastAsia="fr-CH"/>
+        </w:rPr>
+        <w:t>L'application utilise plusieurs mécanismes de sécurité :</w:t>
+      </w:r>
+    </w:p>
+    <w:p>
+      <w:pPr>
+        <w:pStyle w:val="Paragraphedeliste"/>
+        <w:numPr>
+          <w:ilvl w:val="0"/>
+          <w:numId w:val="19"/>
+        </w:numPr>
+        <w:rPr>
+          <w:lang w:eastAsia="fr-CH"/>
+        </w:rPr>
+      </w:pPr>
+      <w:r>
+        <w:rPr>
+          <w:b/>
+          <w:bCs/>
+          <w:lang w:eastAsia="fr-CH"/>
+        </w:rPr>
+        <w:t>Hachage des mots de passe</w:t>
+      </w:r>
+      <w:r>
+        <w:rPr>
+          <w:lang w:eastAsia="fr-CH"/>
+        </w:rPr>
+        <w:t xml:space="preserve"> : Les mots de passe sont hachés avec </w:t>
+      </w:r>
+      <w:r>
+        <w:rPr>
+          <w:i/>
+          <w:iCs/>
+          <w:lang w:eastAsia="fr-CH"/>
+        </w:rPr>
+        <w:t>bcrypt</w:t>
+      </w:r>
+      <w:r>
+        <w:rPr>
+          <w:lang w:eastAsia="fr-CH"/>
+        </w:rPr>
+        <w:t xml:space="preserve"> avant d'être stockés</w:t>
+      </w:r>
+      <w:r>
+        <w:rPr>
+          <w:lang w:eastAsia="fr-CH"/>
+        </w:rPr>
+        <w:t xml:space="preserve"> dans la DB</w:t>
+      </w:r>
+      <w:r>
+        <w:rPr>
+          <w:lang w:eastAsia="fr-CH"/>
+        </w:rPr>
+        <w:t>.</w:t>
+      </w:r>
+    </w:p>
+    <w:p>
+      <w:pPr>
+        <w:pStyle w:val="Paragraphedeliste"/>
+        <w:numPr>
+          <w:ilvl w:val="0"/>
+          <w:numId w:val="19"/>
+        </w:numPr>
+        <w:rPr>
+          <w:lang w:eastAsia="fr-CH"/>
+        </w:rPr>
+      </w:pPr>
+      <w:r>
+        <w:rPr>
+          <w:b/>
+          <w:bCs/>
+          <w:i/>
+          <w:iCs/>
+          <w:lang w:eastAsia="fr-CH"/>
+        </w:rPr>
+        <w:t>JWT</w:t>
+      </w:r>
+      <w:r>
+        <w:rPr>
+          <w:b/>
+          <w:bCs/>
+          <w:lang w:eastAsia="fr-CH"/>
+        </w:rPr>
+        <w:t xml:space="preserve"> (JSON Web Tokens)</w:t>
+      </w:r>
+      <w:r>
+        <w:rPr>
+          <w:lang w:eastAsia="fr-CH"/>
+        </w:rPr>
+        <w:t xml:space="preserve"> : Les </w:t>
+      </w:r>
+      <w:r>
+        <w:rPr>
+          <w:i/>
+          <w:iCs/>
+          <w:lang w:eastAsia="fr-CH"/>
+        </w:rPr>
+        <w:t>tokens JWT</w:t>
+      </w:r>
+      <w:r>
+        <w:rPr>
+          <w:lang w:eastAsia="fr-CH"/>
+        </w:rPr>
+        <w:t xml:space="preserve"> sont utilisés pour authentifier les utilisateurs</w:t>
+      </w:r>
+      <w:r>
+        <w:rPr>
+          <w:lang w:eastAsia="fr-CH"/>
+        </w:rPr>
+        <w:t xml:space="preserve"> et pour garder l’accès</w:t>
+      </w:r>
+      <w:r>
+        <w:rPr>
+          <w:lang w:eastAsia="fr-CH"/>
+        </w:rPr>
+        <w:t>.</w:t>
+      </w:r>
+    </w:p>
+    <w:p>
+      <w:pPr>
+        <w:pStyle w:val="Paragraphedeliste"/>
+        <w:numPr>
+          <w:ilvl w:val="0"/>
+          <w:numId w:val="19"/>
+        </w:numPr>
+        <w:rPr>
+          <w:lang w:eastAsia="fr-CH"/>
+        </w:rPr>
+      </w:pPr>
+      <w:r>
+        <w:rPr>
+          <w:b/>
+          <w:bCs/>
+          <w:i/>
+          <w:iCs/>
+          <w:lang w:eastAsia="fr-CH"/>
+        </w:rPr>
+        <w:t>SSL/TLS</w:t>
+      </w:r>
+      <w:r>
+        <w:rPr>
+          <w:lang w:eastAsia="fr-CH"/>
+        </w:rPr>
+        <w:t xml:space="preserve"> : Les communications entre le client et le serveur sont chiffrées</w:t>
+      </w:r>
+      <w:r>
+        <w:rPr>
+          <w:lang w:eastAsia="fr-CH"/>
+        </w:rPr>
+        <w:t xml:space="preserve"> (</w:t>
+      </w:r>
+      <w:r>
+        <w:rPr>
+          <w:i/>
+          <w:iCs/>
+          <w:lang w:eastAsia="fr-CH"/>
+        </w:rPr>
+        <w:t>https</w:t>
+      </w:r>
+      <w:r>
+        <w:rPr>
+          <w:lang w:eastAsia="fr-CH"/>
+        </w:rPr>
+        <w:t>)</w:t>
+      </w:r>
+      <w:r>
+        <w:rPr>
+          <w:lang w:eastAsia="fr-CH"/>
+        </w:rPr>
+        <w:t>.</w:t>
+      </w:r>
+    </w:p>
+    <w:p>
+      <w:pPr>
+        <w:pStyle w:val="Titre3"/>
+        <w:rPr>
+          <w:lang w:eastAsia="fr-CH"/>
+        </w:rPr>
+      </w:pPr>
+      <w:bookmarkStart w:id="11" w:name="_Toc192509025"/>
+      <w:r>
+        <w:rPr>
+          <w:lang w:eastAsia="fr-CH"/>
+        </w:rPr>
+        <w:lastRenderedPageBreak/>
+        <w:t>Docker</w:t>
+      </w:r>
+      <w:bookmarkEnd w:id="11"/>
+    </w:p>
+    <w:p>
+      <w:pPr>
+        <w:rPr>
+          <w:lang w:eastAsia="fr-CH"/>
+        </w:rPr>
+      </w:pPr>
+      <w:r>
+        <w:rPr>
+          <w:lang w:eastAsia="fr-CH"/>
+        </w:rPr>
+        <w:t xml:space="preserve">Docker est utilisé pour containeriser l'application et ses dépendances. Le fichier </w:t>
+      </w:r>
+      <w:r>
+        <w:rPr>
+          <w:lang w:eastAsia="fr-CH"/>
+        </w:rPr>
+        <w:t>« </w:t>
+      </w:r>
+      <w:r>
+        <w:rPr>
+          <w:i/>
+          <w:iCs/>
+          <w:lang w:eastAsia="fr-CH"/>
+        </w:rPr>
+        <w:t>docker-compose.yml</w:t>
+      </w:r>
+      <w:r>
+        <w:rPr>
+          <w:lang w:eastAsia="fr-CH"/>
+        </w:rPr>
+        <w:t> »</w:t>
+      </w:r>
+      <w:r>
+        <w:rPr>
+          <w:lang w:eastAsia="fr-CH"/>
+        </w:rPr>
+        <w:t xml:space="preserve"> définit les services nécessaires, y compris le serveur Node.js et le serveur </w:t>
+      </w:r>
+      <w:r>
+        <w:rPr>
+          <w:i/>
+          <w:iCs/>
+          <w:lang w:eastAsia="fr-CH"/>
+        </w:rPr>
+        <w:t>MySQL</w:t>
+      </w:r>
+      <w:r>
+        <w:rPr>
+          <w:lang w:eastAsia="fr-CH"/>
+        </w:rPr>
+        <w:t>.</w:t>
+      </w:r>
     </w:p>
     <w:p>
       <w:pPr>
         <w:pStyle w:val="Titre2"/>
       </w:pPr>
-      <w:bookmarkStart w:id="7" w:name="_Toc188950857"/>
+      <w:bookmarkStart w:id="12" w:name="_Toc192509026"/>
       <w:r>
         <w:lastRenderedPageBreak/>
         <w:t>Explication code</w:t>
       </w:r>
-      <w:bookmarkEnd w:id="7"/>
+      <w:bookmarkEnd w:id="12"/>
     </w:p>
     <w:p>
       <w:pPr>
@@ -2089,14 +3433,14 @@
           <w:lang w:eastAsia="fr-CH"/>
         </w:rPr>
       </w:pPr>
-      <w:bookmarkStart w:id="8" w:name="_Toc188950858"/>
+      <w:bookmarkStart w:id="13" w:name="_Toc192509027"/>
       <w:r>
         <w:rPr>
           <w:lang w:eastAsia="fr-CH"/>
         </w:rPr>
         <w:t>Configuration OpenSSL</w:t>
       </w:r>
-      <w:bookmarkEnd w:id="8"/>
+      <w:bookmarkEnd w:id="13"/>
     </w:p>
     <w:p>
       <w:pPr>
@@ -2120,11 +3464,51 @@
       </w:pPr>
       <w:r>
         <w:rPr>
+          <w:lang w:eastAsia="fr-CH"/>
+        </w:rPr>
+        <w:t xml:space="preserve">Avec la commande suivante, on va créer une clé privée qui sert à </w:t>
+      </w:r>
+      <w:r>
+        <w:rPr>
+          <w:lang w:eastAsia="fr-CH"/>
+        </w:rPr>
+        <w:t>générer la demande de signature de certificat (</w:t>
+      </w:r>
+      <w:r>
+        <w:rPr>
+          <w:i/>
+          <w:iCs/>
+          <w:lang w:eastAsia="fr-CH"/>
+        </w:rPr>
+        <w:t>CSR</w:t>
+      </w:r>
+      <w:r>
+        <w:rPr>
+          <w:lang w:eastAsia="fr-CH"/>
+        </w:rPr>
+        <w:t>) et signer le certificat auto-signé</w:t>
+      </w:r>
+      <w:r>
+        <w:rPr>
+          <w:lang w:eastAsia="fr-CH"/>
+        </w:rPr>
+        <w:t>.</w:t>
+      </w:r>
+    </w:p>
+    <w:p>
+      <w:pPr>
+        <w:jc w:val="center"/>
+        <w:rPr>
+          <w:lang w:eastAsia="fr-CH"/>
+        </w:rPr>
+      </w:pPr>
+      <w:r>
+        <w:rPr>
           <w:noProof/>
           <w:lang w:eastAsia="fr-CH"/>
         </w:rPr>
         <w:drawing>
-          <wp:inline distT="0" distB="0" distL="0" distR="0" wp14:anchorId="33E75E35" wp14:editId="0E7C9DB8">
+          <wp:inline distT="0" distB="0" distL="0" distR="0" wp14:anchorId="33E75E35" wp14:editId="135890B8">
             <wp:extent cx="2876951" cy="247685"/>
             <wp:effectExtent l="19050" t="19050" r="19050" b="19050"/>
             <wp:docPr id="8" name="Image 8"/>
@@ -2139,7 +3523,7 @@
                     <pic:cNvPicPr/>
                   </pic:nvPicPr>
                   <pic:blipFill>
-                    <a:blip r:embed="rId18"/>
+                    <a:blip r:embed="rId19"/>
                     <a:stretch>
                       <a:fillRect/>
                     </a:stretch>
@@ -2189,6 +3573,78 @@
       </w:pPr>
       <w:r>
         <w:rPr>
+          <w:lang w:eastAsia="fr-CH"/>
+        </w:rPr>
+        <w:t>Puis, il faut</w:t>
+      </w:r>
+      <w:r>
+        <w:rPr>
+          <w:lang w:eastAsia="fr-CH"/>
+        </w:rPr>
+        <w:t xml:space="preserve"> </w:t>
+      </w:r>
+      <w:r>
+        <w:rPr>
+          <w:lang w:eastAsia="fr-CH"/>
+        </w:rPr>
+        <w:t>créer</w:t>
+      </w:r>
+      <w:r>
+        <w:rPr>
+          <w:lang w:eastAsia="fr-CH"/>
+        </w:rPr>
+        <w:t xml:space="preserve"> une demande de signature de certificat (</w:t>
+      </w:r>
+      <w:r>
+        <w:rPr>
+          <w:i/>
+          <w:iCs/>
+          <w:lang w:eastAsia="fr-CH"/>
+        </w:rPr>
+        <w:t>CSR</w:t>
+      </w:r>
+      <w:r>
+        <w:rPr>
+          <w:lang w:eastAsia="fr-CH"/>
+        </w:rPr>
+        <w:t xml:space="preserve">) en utilisant la clé privée générée </w:t>
+      </w:r>
+      <w:r>
+        <w:rPr>
+          <w:lang w:eastAsia="fr-CH"/>
+        </w:rPr>
+        <w:t>avant</w:t>
+      </w:r>
+      <w:r>
+        <w:rPr>
+          <w:lang w:eastAsia="fr-CH"/>
+        </w:rPr>
+        <w:t>. Cette demande sera utilisée pour obtenir un certificat signé par une autorité de certification (</w:t>
+      </w:r>
+      <w:r>
+        <w:rPr>
+          <w:i/>
+          <w:iCs/>
+          <w:lang w:eastAsia="fr-CH"/>
+        </w:rPr>
+        <w:t>CA</w:t>
+      </w:r>
+      <w:r>
+        <w:rPr>
+          <w:lang w:eastAsia="fr-CH"/>
+        </w:rPr>
+        <w:t>) ou pour générer un certificat auto-signé.</w:t>
+      </w:r>
+    </w:p>
+    <w:p>
+      <w:pPr>
+        <w:jc w:val="center"/>
+        <w:rPr>
+          <w:lang w:eastAsia="fr-CH"/>
+        </w:rPr>
+      </w:pPr>
+      <w:r>
+        <w:rPr>
           <w:noProof/>
           <w:lang w:eastAsia="fr-CH"/>
         </w:rPr>
@@ -2208,7 +3664,7 @@
                     <pic:cNvPicPr/>
                   </pic:nvPicPr>
                   <pic:blipFill>
-                    <a:blip r:embed="rId19"/>
+                    <a:blip r:embed="rId20"/>
                     <a:stretch>
                       <a:fillRect/>
                     </a:stretch>
@@ -2258,6 +3714,76 @@
       </w:pPr>
       <w:r>
         <w:rPr>
+          <w:lang w:eastAsia="fr-CH"/>
+        </w:rPr>
+        <w:t xml:space="preserve">Enfin, </w:t>
+      </w:r>
+      <w:r>
+        <w:rPr>
+          <w:lang w:eastAsia="fr-CH"/>
+        </w:rPr>
+        <w:t>avec la commande ci-dessous, on génère</w:t>
+      </w:r>
+      <w:r>
+        <w:rPr>
+          <w:lang w:eastAsia="fr-CH"/>
+        </w:rPr>
+        <w:t xml:space="preserve"> un certificat auto-signé en utilisant l</w:t>
+      </w:r>
+      <w:r>
+        <w:rPr>
+          <w:lang w:eastAsia="fr-CH"/>
+        </w:rPr>
+        <w:t xml:space="preserve">es éléments générés </w:t>
+      </w:r>
+      <w:r>
+        <w:rPr>
+          <w:lang w:eastAsia="fr-CH"/>
+        </w:rPr>
+        <w:t>précédemment</w:t>
+      </w:r>
+      <w:r>
+        <w:rPr>
+          <w:lang w:eastAsia="fr-CH"/>
+        </w:rPr>
+        <w:t xml:space="preserve">. Ce certificat </w:t>
+      </w:r>
+      <w:r>
+        <w:rPr>
+          <w:lang w:eastAsia="fr-CH"/>
+        </w:rPr>
+        <w:t>sert à</w:t>
+      </w:r>
+      <w:r>
+        <w:rPr>
+          <w:lang w:eastAsia="fr-CH"/>
+        </w:rPr>
+        <w:t xml:space="preserve"> sécuriser les communications </w:t>
+      </w:r>
+      <w:r>
+        <w:rPr>
+          <w:i/>
+          <w:iCs/>
+          <w:lang w:eastAsia="fr-CH"/>
+        </w:rPr>
+        <w:t>HTTPS</w:t>
+      </w:r>
+      <w:r>
+        <w:rPr>
+          <w:lang w:eastAsia="fr-CH"/>
+        </w:rPr>
+        <w:t xml:space="preserve"> entre le client et le serveur.</w:t>
+      </w:r>
+    </w:p>
+    <w:p>
+      <w:pPr>
+        <w:jc w:val="center"/>
+        <w:rPr>
+          <w:lang w:eastAsia="fr-CH"/>
+        </w:rPr>
+      </w:pPr>
+      <w:r>
+        <w:rPr>
           <w:noProof/>
           <w:lang w:eastAsia="fr-CH"/>
         </w:rPr>
@@ -2277,7 +3803,7 @@
                     <pic:cNvPicPr/>
                   </pic:nvPicPr>
                   <pic:blipFill>
-                    <a:blip r:embed="rId20"/>
+                    <a:blip r:embed="rId21"/>
                     <a:stretch>
                       <a:fillRect/>
                     </a:stretch>
@@ -2307,46 +3833,1421 @@
     </w:p>
     <w:p>
       <w:pPr>
+        <w:pStyle w:val="Titre3"/>
+        <w:rPr>
+          <w:lang w:eastAsia="fr-CH"/>
+        </w:rPr>
+      </w:pPr>
+      <w:bookmarkStart w:id="14" w:name="_Toc192509028"/>
+      <w:r>
+        <w:rPr>
+          <w:lang w:eastAsia="fr-CH"/>
+        </w:rPr>
+        <w:t>Gestion des utilisateurs</w:t>
+      </w:r>
+      <w:bookmarkEnd w:id="14"/>
+    </w:p>
+    <w:p>
+      <w:pPr>
+        <w:pStyle w:val="Titre4"/>
+        <w:rPr>
+          <w:lang w:val="en-US" w:eastAsia="fr-CH"/>
+        </w:rPr>
+      </w:pPr>
+      <w:r>
+        <w:rPr>
+          <w:lang w:val="en-US" w:eastAsia="fr-CH"/>
+        </w:rPr>
+        <w:t>DB (t</w:t>
+      </w:r>
+      <w:r>
+        <w:rPr>
+          <w:lang w:val="en-US" w:eastAsia="fr-CH"/>
+        </w:rPr>
+        <w:t xml:space="preserve">able </w:t>
+      </w:r>
+      <w:r>
+        <w:rPr>
+          <w:i/>
+          <w:iCs w:val="0"/>
+          <w:lang w:val="en-US" w:eastAsia="fr-CH"/>
+        </w:rPr>
+        <w:t>User</w:t>
+      </w:r>
+      <w:r>
+        <w:rPr>
+          <w:lang w:val="en-US" w:eastAsia="fr-CH"/>
+        </w:rPr>
+        <w:t>)</w:t>
+      </w:r>
+    </w:p>
+    <w:p>
+      <w:pPr>
+        <w:rPr>
+          <w:lang w:eastAsia="fr-CH"/>
+        </w:rPr>
+      </w:pPr>
+      <w:r>
+        <w:rPr>
+          <w:lang w:eastAsia="fr-CH"/>
+        </w:rPr>
+        <w:t xml:space="preserve">Pour faire une bonne gestion </w:t>
+      </w:r>
+      <w:r>
+        <w:rPr>
+          <w:lang w:eastAsia="fr-CH"/>
+        </w:rPr>
+        <w:t>des utilisateurs</w:t>
+      </w:r>
+      <w:r>
+        <w:rPr>
+          <w:lang w:eastAsia="fr-CH"/>
+        </w:rPr>
+        <w:t xml:space="preserve">, une table, </w:t>
+      </w:r>
+      <w:r>
+        <w:rPr>
+          <w:lang w:eastAsia="fr-CH"/>
+        </w:rPr>
+        <w:t>« </w:t>
+      </w:r>
+      <w:r>
+        <w:rPr>
+          <w:i/>
+          <w:iCs/>
+          <w:lang w:eastAsia="fr-CH"/>
+        </w:rPr>
+        <w:t>t_user</w:t>
+      </w:r>
+      <w:r>
+        <w:rPr>
+          <w:lang w:eastAsia="fr-CH"/>
+        </w:rPr>
+        <w:t> »</w:t>
+      </w:r>
+      <w:r>
+        <w:rPr>
+          <w:lang w:eastAsia="fr-CH"/>
+        </w:rPr>
+        <w:t>, a été créer avec les suivantes colonnes :</w:t>
+      </w:r>
+    </w:p>
+    <w:p>
+      <w:pPr>
+        <w:pStyle w:val="Paragraphedeliste"/>
+        <w:numPr>
+          <w:ilvl w:val="0"/>
+          <w:numId w:val="20"/>
+        </w:numPr>
+        <w:rPr>
+          <w:lang w:eastAsia="fr-CH"/>
+        </w:rPr>
+      </w:pPr>
+      <w:r>
+        <w:rPr>
+          <w:lang w:eastAsia="fr-CH"/>
+        </w:rPr>
+        <w:t>i</w:t>
+      </w:r>
+      <w:r>
+        <w:rPr>
+          <w:lang w:eastAsia="fr-CH"/>
+        </w:rPr>
+        <w:t>d</w:t>
+      </w:r>
+      <w:r>
+        <w:rPr>
+          <w:lang w:eastAsia="fr-CH"/>
+        </w:rPr>
+        <w:t> :</w:t>
+      </w:r>
+      <w:r>
+        <w:rPr>
+          <w:lang w:eastAsia="fr-CH"/>
+        </w:rPr>
+        <w:t xml:space="preserve"> </w:t>
+      </w:r>
+      <w:r>
+        <w:rPr>
+          <w:lang w:eastAsia="fr-CH"/>
+        </w:rPr>
+        <w:t>C’est l’ID de l’utilisateur qui se incrément de 1 à chaque inscription.</w:t>
+      </w:r>
+    </w:p>
+    <w:p>
+      <w:pPr>
+        <w:pStyle w:val="Paragraphedeliste"/>
+        <w:numPr>
+          <w:ilvl w:val="0"/>
+          <w:numId w:val="20"/>
+        </w:numPr>
+        <w:rPr>
+          <w:lang w:eastAsia="fr-CH"/>
+        </w:rPr>
+      </w:pPr>
+      <w:r>
+        <w:rPr>
+          <w:lang w:eastAsia="fr-CH"/>
+        </w:rPr>
+        <w:t>u</w:t>
+      </w:r>
+      <w:r>
+        <w:rPr>
+          <w:lang w:eastAsia="fr-CH"/>
+        </w:rPr>
+        <w:t>sername</w:t>
+      </w:r>
+      <w:r>
+        <w:rPr>
+          <w:lang w:eastAsia="fr-CH"/>
+        </w:rPr>
+        <w:t> :</w:t>
+      </w:r>
+      <w:r>
+        <w:rPr>
+          <w:lang w:eastAsia="fr-CH"/>
+        </w:rPr>
+        <w:t xml:space="preserve"> </w:t>
+      </w:r>
+      <w:r>
+        <w:rPr>
+          <w:lang w:eastAsia="fr-CH"/>
+        </w:rPr>
+        <w:t>C’est le nom de l’utilisateur.</w:t>
+      </w:r>
+    </w:p>
+    <w:p>
+      <w:pPr>
+        <w:pStyle w:val="Paragraphedeliste"/>
+        <w:numPr>
+          <w:ilvl w:val="0"/>
+          <w:numId w:val="20"/>
+        </w:numPr>
+        <w:rPr>
+          <w:lang w:eastAsia="fr-CH"/>
+        </w:rPr>
+      </w:pPr>
+      <w:r>
+        <w:rPr>
+          <w:lang w:eastAsia="fr-CH"/>
+        </w:rPr>
+        <w:t>passwordHash</w:t>
+      </w:r>
+      <w:r>
+        <w:rPr>
+          <w:lang w:eastAsia="fr-CH"/>
+        </w:rPr>
+        <w:t> :</w:t>
+      </w:r>
+      <w:r>
+        <w:rPr>
+          <w:lang w:eastAsia="fr-CH"/>
+        </w:rPr>
+        <w:t xml:space="preserve"> </w:t>
+      </w:r>
+      <w:r>
+        <w:rPr>
+          <w:lang w:eastAsia="fr-CH"/>
+        </w:rPr>
+        <w:t>C’est le mot de passe haché</w:t>
+      </w:r>
+    </w:p>
+    <w:p>
+      <w:pPr>
+        <w:pStyle w:val="Paragraphedeliste"/>
+        <w:numPr>
+          <w:ilvl w:val="0"/>
+          <w:numId w:val="20"/>
+        </w:numPr>
+        <w:rPr>
+          <w:lang w:eastAsia="fr-CH"/>
+        </w:rPr>
+      </w:pPr>
+      <w:r>
+        <w:rPr>
+          <w:lang w:eastAsia="fr-CH"/>
+        </w:rPr>
+        <w:t>salt</w:t>
+      </w:r>
+      <w:r>
+        <w:rPr>
+          <w:lang w:eastAsia="fr-CH"/>
+        </w:rPr>
+        <w:t> :</w:t>
+      </w:r>
+      <w:r>
+        <w:rPr>
+          <w:lang w:eastAsia="fr-CH"/>
+        </w:rPr>
+        <w:t xml:space="preserve"> C’est le </w:t>
+      </w:r>
+      <w:r>
+        <w:rPr>
+          <w:i/>
+          <w:iCs/>
+          <w:lang w:eastAsia="fr-CH"/>
+        </w:rPr>
+        <w:t>salt</w:t>
+      </w:r>
+      <w:r>
+        <w:rPr>
+          <w:lang w:eastAsia="fr-CH"/>
+        </w:rPr>
+        <w:t xml:space="preserve"> utilisé pour </w:t>
+      </w:r>
+      <w:r>
+        <w:rPr>
+          <w:lang w:eastAsia="fr-CH"/>
+        </w:rPr>
+        <w:t xml:space="preserve">le </w:t>
+      </w:r>
+      <w:r>
+        <w:rPr>
+          <w:i/>
+          <w:iCs/>
+          <w:lang w:eastAsia="fr-CH"/>
+        </w:rPr>
+        <w:t>hachage</w:t>
+      </w:r>
+      <w:r>
+        <w:rPr>
+          <w:lang w:eastAsia="fr-CH"/>
+        </w:rPr>
+        <w:t xml:space="preserve"> du mot de passe</w:t>
+      </w:r>
+      <w:r>
+        <w:rPr>
+          <w:lang w:eastAsia="fr-CH"/>
+        </w:rPr>
+        <w:t>.</w:t>
+      </w:r>
+    </w:p>
+    <w:p>
+      <w:pPr>
+        <w:pStyle w:val="Paragraphedeliste"/>
+        <w:numPr>
+          <w:ilvl w:val="0"/>
+          <w:numId w:val="20"/>
+        </w:numPr>
+        <w:rPr>
+          <w:lang w:eastAsia="fr-CH"/>
+        </w:rPr>
+      </w:pPr>
+      <w:r>
+        <w:rPr>
+          <w:lang w:eastAsia="fr-CH"/>
+        </w:rPr>
+        <w:t>isAdmin</w:t>
+      </w:r>
+      <w:r>
+        <w:rPr>
+          <w:lang w:eastAsia="fr-CH"/>
+        </w:rPr>
+        <w:t> :</w:t>
+      </w:r>
+      <w:r>
+        <w:rPr>
+          <w:lang w:eastAsia="fr-CH"/>
+        </w:rPr>
+        <w:t xml:space="preserve"> C’est le rôle de l’utilisateur qui par défaut est « </w:t>
+      </w:r>
+      <w:r>
+        <w:rPr>
+          <w:i/>
+          <w:iCs/>
+          <w:lang w:eastAsia="fr-CH"/>
+        </w:rPr>
+        <w:t>false</w:t>
+      </w:r>
+      <w:r>
+        <w:rPr>
+          <w:i/>
+          <w:iCs/>
+          <w:lang w:eastAsia="fr-CH"/>
+        </w:rPr>
+        <w:t> </w:t>
+      </w:r>
+      <w:r>
+        <w:rPr>
+          <w:lang w:eastAsia="fr-CH"/>
+        </w:rPr>
+        <w:t>»</w:t>
+      </w:r>
+      <w:r>
+        <w:rPr>
+          <w:lang w:eastAsia="fr-CH"/>
+        </w:rPr>
+        <w:t>.</w:t>
+      </w:r>
+    </w:p>
+    <w:p>
+      <w:pPr>
+        <w:pStyle w:val="Paragraphedeliste"/>
+        <w:numPr>
+          <w:ilvl w:val="0"/>
+          <w:numId w:val="20"/>
+        </w:numPr>
+        <w:rPr>
+          <w:lang w:eastAsia="fr-CH"/>
+        </w:rPr>
+      </w:pPr>
+      <w:r>
+        <w:rPr>
+          <w:lang w:eastAsia="fr-CH"/>
+        </w:rPr>
+        <w:t>createdAt</w:t>
+      </w:r>
+      <w:r>
+        <w:rPr>
+          <w:lang w:eastAsia="fr-CH"/>
+        </w:rPr>
+        <w:t> :</w:t>
+      </w:r>
+      <w:r>
+        <w:rPr>
+          <w:lang w:eastAsia="fr-CH"/>
+        </w:rPr>
+        <w:t xml:space="preserve"> C’est la date de création du compte.</w:t>
+      </w:r>
+    </w:p>
+    <w:p>
+      <w:pPr>
+        <w:pStyle w:val="Titre4"/>
+        <w:rPr>
+          <w:lang w:eastAsia="fr-CH"/>
+        </w:rPr>
+      </w:pPr>
+      <w:r>
+        <w:rPr>
+          <w:lang w:eastAsia="fr-CH"/>
+        </w:rPr>
+        <w:lastRenderedPageBreak/>
+        <w:t>Inscription (</w:t>
+      </w:r>
+      <w:r>
+        <w:rPr>
+          <w:i/>
+          <w:iCs w:val="0"/>
+          <w:lang w:eastAsia="fr-CH"/>
+        </w:rPr>
+        <w:t>Register</w:t>
+      </w:r>
+      <w:r>
+        <w:rPr>
+          <w:lang w:eastAsia="fr-CH"/>
+        </w:rPr>
+        <w:t>)</w:t>
+      </w:r>
+    </w:p>
+    <w:p>
+      <w:pPr>
+        <w:jc w:val="center"/>
+        <w:rPr>
+          <w:lang w:eastAsia="fr-CH"/>
+        </w:rPr>
+      </w:pPr>
+      <w:r>
+        <w:rPr>
+          <w:lang w:eastAsia="fr-CH"/>
+        </w:rPr>
+        <w:drawing>
+          <wp:inline distT="0" distB="0" distL="0" distR="0" wp14:anchorId="2B81AAE0" wp14:editId="2943F608">
+            <wp:extent cx="5760720" cy="5572760"/>
+            <wp:effectExtent l="19050" t="19050" r="11430" b="27940"/>
+            <wp:docPr id="10" name="Image 10"/>
+            <wp:cNvGraphicFramePr>
+              <a:graphicFrameLocks xmlns:a="http://schemas.openxmlformats.org/drawingml/2006/main" noChangeAspect="1"/>
+            </wp:cNvGraphicFramePr>
+            <a:graphic xmlns:a="http://schemas.openxmlformats.org/drawingml/2006/main">
+              <a:graphicData uri="http://schemas.openxmlformats.org/drawingml/2006/picture">
+                <pic:pic xmlns:pic="http://schemas.openxmlformats.org/drawingml/2006/picture">
+                  <pic:nvPicPr>
+                    <pic:cNvPr id="1" name=""/>
+                    <pic:cNvPicPr/>
+                  </pic:nvPicPr>
+                  <pic:blipFill>
+                    <a:blip r:embed="rId22"/>
+                    <a:stretch>
+                      <a:fillRect/>
+                    </a:stretch>
+                  </pic:blipFill>
+                  <pic:spPr>
+                    <a:xfrm>
+                      <a:off x="0" y="0"/>
+                      <a:ext cx="5760720" cy="5572760"/>
+                    </a:xfrm>
+                    <a:prstGeom prst="rect">
+                      <a:avLst/>
+                    </a:prstGeom>
+                    <a:ln>
+                      <a:solidFill>
+                        <a:schemeClr val="bg1">
+                          <a:lumMod val="75000"/>
+                        </a:schemeClr>
+                      </a:solidFill>
+                    </a:ln>
+                  </pic:spPr>
+                </pic:pic>
+              </a:graphicData>
+            </a:graphic>
+          </wp:inline>
+        </w:drawing>
+      </w:r>
+    </w:p>
+    <w:p>
+      <w:pPr>
+        <w:rPr>
+          <w:lang w:eastAsia="fr-CH"/>
+        </w:rPr>
+      </w:pPr>
+      <w:r>
+        <w:rPr>
+          <w:lang w:eastAsia="fr-CH"/>
+        </w:rPr>
+        <w:t>…</w:t>
+      </w:r>
+    </w:p>
+    <w:p>
+      <w:pPr>
+        <w:rPr>
+          <w:b/>
+          <w:bCs/>
+          <w:lang w:eastAsia="fr-CH"/>
+        </w:rPr>
+      </w:pPr>
+      <w:r>
+        <w:rPr>
+          <w:b/>
+          <w:bCs/>
+          <w:lang w:eastAsia="fr-CH"/>
+        </w:rPr>
+        <w:t>Hachage (Bcrypt)</w:t>
+      </w:r>
+    </w:p>
+    <w:p>
+      <w:pPr>
+        <w:rPr>
+          <w:lang w:eastAsia="fr-CH"/>
+        </w:rPr>
+      </w:pPr>
+      <w:r>
+        <w:rPr>
+          <w:lang w:eastAsia="fr-CH"/>
+        </w:rPr>
+        <w:t>…</w:t>
+      </w:r>
+    </w:p>
+    <w:p>
+      <w:pPr>
+        <w:pStyle w:val="Titre4"/>
+        <w:rPr>
+          <w:lang w:eastAsia="fr-CH"/>
+        </w:rPr>
+      </w:pPr>
+      <w:r>
+        <w:rPr>
+          <w:lang w:eastAsia="fr-CH"/>
+        </w:rPr>
+        <w:lastRenderedPageBreak/>
+        <w:t>Accès (</w:t>
+      </w:r>
+      <w:r>
+        <w:rPr>
+          <w:i/>
+          <w:iCs w:val="0"/>
+          <w:lang w:eastAsia="fr-CH"/>
+        </w:rPr>
+        <w:t>Login</w:t>
+      </w:r>
+      <w:r>
+        <w:rPr>
+          <w:lang w:eastAsia="fr-CH"/>
+        </w:rPr>
+        <w:t>)</w:t>
+      </w:r>
+    </w:p>
+    <w:p>
+      <w:pPr>
+        <w:jc w:val="center"/>
+        <w:rPr>
+          <w:lang w:eastAsia="fr-CH"/>
+        </w:rPr>
+      </w:pPr>
+      <w:r>
+        <w:rPr>
+          <w:lang w:eastAsia="fr-CH"/>
+        </w:rPr>
+        <w:drawing>
+          <wp:inline distT="0" distB="0" distL="0" distR="0" wp14:anchorId="473769D3" wp14:editId="4D63559F">
+            <wp:extent cx="5210902" cy="7278116"/>
+            <wp:effectExtent l="19050" t="19050" r="27940" b="18415"/>
+            <wp:docPr id="11" name="Image 11"/>
+            <wp:cNvGraphicFramePr>
+              <a:graphicFrameLocks xmlns:a="http://schemas.openxmlformats.org/drawingml/2006/main" noChangeAspect="1"/>
+            </wp:cNvGraphicFramePr>
+            <a:graphic xmlns:a="http://schemas.openxmlformats.org/drawingml/2006/main">
+              <a:graphicData uri="http://schemas.openxmlformats.org/drawingml/2006/picture">
+                <pic:pic xmlns:pic="http://schemas.openxmlformats.org/drawingml/2006/picture">
+                  <pic:nvPicPr>
+                    <pic:cNvPr id="1" name=""/>
+                    <pic:cNvPicPr/>
+                  </pic:nvPicPr>
+                  <pic:blipFill>
+                    <a:blip r:embed="rId23"/>
+                    <a:stretch>
+                      <a:fillRect/>
+                    </a:stretch>
+                  </pic:blipFill>
+                  <pic:spPr>
+                    <a:xfrm>
+                      <a:off x="0" y="0"/>
+                      <a:ext cx="5210902" cy="7278116"/>
+                    </a:xfrm>
+                    <a:prstGeom prst="rect">
+                      <a:avLst/>
+                    </a:prstGeom>
+                    <a:ln>
+                      <a:solidFill>
+                        <a:schemeClr val="bg1">
+                          <a:lumMod val="75000"/>
+                        </a:schemeClr>
+                      </a:solidFill>
+                    </a:ln>
+                  </pic:spPr>
+                </pic:pic>
+              </a:graphicData>
+            </a:graphic>
+          </wp:inline>
+        </w:drawing>
+      </w:r>
+    </w:p>
+    <w:p>
+      <w:pPr>
+        <w:rPr>
+          <w:lang w:eastAsia="fr-CH"/>
+        </w:rPr>
+      </w:pPr>
+      <w:r>
+        <w:rPr>
+          <w:lang w:eastAsia="fr-CH"/>
+        </w:rPr>
+        <w:t>…</w:t>
+      </w:r>
+    </w:p>
+    <w:p>
+      <w:pPr>
+        <w:rPr>
+          <w:b/>
+          <w:bCs/>
+          <w:lang w:eastAsia="fr-CH"/>
+        </w:rPr>
+      </w:pPr>
+      <w:proofErr w:type="spellStart"/>
+      <w:r>
+        <w:rPr>
+          <w:b/>
+          <w:bCs/>
+          <w:lang w:eastAsia="fr-CH"/>
+        </w:rPr>
+        <w:t>Token</w:t>
+      </w:r>
+      <w:proofErr w:type="spellEnd"/>
+      <w:r>
+        <w:rPr>
+          <w:b/>
+          <w:bCs/>
+          <w:lang w:eastAsia="fr-CH"/>
+        </w:rPr>
+        <w:t xml:space="preserve"> (Jeton JWT)</w:t>
+      </w:r>
+    </w:p>
+    <w:p>
+      <w:pPr>
+        <w:rPr>
+          <w:lang w:eastAsia="fr-CH"/>
+        </w:rPr>
+      </w:pPr>
+      <w:r>
+        <w:rPr>
+          <w:lang w:eastAsia="fr-CH"/>
+        </w:rPr>
+        <w:t>…</w:t>
+      </w:r>
+    </w:p>
+    <w:p>
+      <w:pPr>
+        <w:pStyle w:val="Titre4"/>
+        <w:rPr>
+          <w:lang w:eastAsia="fr-CH"/>
+        </w:rPr>
+      </w:pPr>
+      <w:r>
+        <w:rPr>
+          <w:lang w:eastAsia="fr-CH"/>
+        </w:rPr>
+        <w:lastRenderedPageBreak/>
+        <w:t>Middleware</w:t>
+      </w:r>
+      <w:r>
+        <w:rPr>
+          <w:lang w:eastAsia="fr-CH"/>
+        </w:rPr>
+        <w:t xml:space="preserve"> d'authentification</w:t>
+      </w:r>
+    </w:p>
+    <w:p>
+      <w:pPr>
+        <w:rPr>
+          <w:lang w:eastAsia="fr-CH"/>
+        </w:rPr>
+      </w:pPr>
+      <w:r>
+        <w:rPr>
+          <w:lang w:eastAsia="fr-CH"/>
+        </w:rPr>
+        <w:t>« </w:t>
+      </w:r>
+      <w:r>
+        <w:rPr>
+          <w:b/>
+          <w:bCs/>
+          <w:lang w:eastAsia="fr-CH"/>
+        </w:rPr>
+        <w:t>Auth.mjs</w:t>
+      </w:r>
+      <w:r>
+        <w:rPr>
+          <w:lang w:eastAsia="fr-CH"/>
+        </w:rPr>
+        <w:t> »</w:t>
+      </w:r>
+      <w:r>
+        <w:rPr>
+          <w:lang w:eastAsia="fr-CH"/>
+        </w:rPr>
+        <w:t> :</w:t>
+      </w:r>
+    </w:p>
+    <w:p>
+      <w:pPr>
+        <w:jc w:val="center"/>
+        <w:rPr>
+          <w:lang w:eastAsia="fr-CH"/>
+        </w:rPr>
+      </w:pPr>
+      <w:r>
+        <w:rPr>
+          <w:lang w:eastAsia="fr-CH"/>
+        </w:rPr>
+        <w:drawing>
+          <wp:inline distT="0" distB="0" distL="0" distR="0" wp14:anchorId="3681C1CC" wp14:editId="55B9BC35">
+            <wp:extent cx="4686954" cy="3505689"/>
+            <wp:effectExtent l="19050" t="19050" r="18415" b="19050"/>
+            <wp:docPr id="13" name="Image 13"/>
+            <wp:cNvGraphicFramePr>
+              <a:graphicFrameLocks xmlns:a="http://schemas.openxmlformats.org/drawingml/2006/main" noChangeAspect="1"/>
+            </wp:cNvGraphicFramePr>
+            <a:graphic xmlns:a="http://schemas.openxmlformats.org/drawingml/2006/main">
+              <a:graphicData uri="http://schemas.openxmlformats.org/drawingml/2006/picture">
+                <pic:pic xmlns:pic="http://schemas.openxmlformats.org/drawingml/2006/picture">
+                  <pic:nvPicPr>
+                    <pic:cNvPr id="1" name=""/>
+                    <pic:cNvPicPr/>
+                  </pic:nvPicPr>
+                  <pic:blipFill>
+                    <a:blip r:embed="rId24"/>
+                    <a:stretch>
+                      <a:fillRect/>
+                    </a:stretch>
+                  </pic:blipFill>
+                  <pic:spPr>
+                    <a:xfrm>
+                      <a:off x="0" y="0"/>
+                      <a:ext cx="4686954" cy="3505689"/>
+                    </a:xfrm>
+                    <a:prstGeom prst="rect">
+                      <a:avLst/>
+                    </a:prstGeom>
+                    <a:ln>
+                      <a:solidFill>
+                        <a:schemeClr val="bg1">
+                          <a:lumMod val="75000"/>
+                        </a:schemeClr>
+                      </a:solidFill>
+                    </a:ln>
+                  </pic:spPr>
+                </pic:pic>
+              </a:graphicData>
+            </a:graphic>
+          </wp:inline>
+        </w:drawing>
+      </w:r>
+    </w:p>
+    <w:p>
+      <w:pPr>
+        <w:rPr>
+          <w:lang w:eastAsia="fr-CH"/>
+        </w:rPr>
+      </w:pPr>
+    </w:p>
+    <w:p>
+      <w:pPr>
+        <w:rPr>
+          <w:lang w:eastAsia="fr-CH"/>
+        </w:rPr>
+      </w:pPr>
+      <w:r>
+        <w:rPr>
+          <w:lang w:eastAsia="fr-CH"/>
+        </w:rPr>
+        <w:t>« </w:t>
+      </w:r>
+      <w:r>
+        <w:rPr>
+          <w:b/>
+          <w:bCs/>
+          <w:lang w:eastAsia="fr-CH"/>
+        </w:rPr>
+        <w:t>RedirectIfAuthenticated.mjs</w:t>
+      </w:r>
+      <w:r>
+        <w:rPr>
+          <w:lang w:eastAsia="fr-CH"/>
+        </w:rPr>
+        <w:t> »</w:t>
+      </w:r>
+      <w:r>
+        <w:rPr>
+          <w:lang w:eastAsia="fr-CH"/>
+        </w:rPr>
+        <w:t> :</w:t>
+      </w:r>
+    </w:p>
+    <w:p>
+      <w:pPr>
+        <w:jc w:val="center"/>
+        <w:rPr>
+          <w:lang w:eastAsia="fr-CH"/>
+        </w:rPr>
+      </w:pPr>
+      <w:r>
+        <w:rPr>
+          <w:lang w:eastAsia="fr-CH"/>
+        </w:rPr>
+        <w:drawing>
+          <wp:inline distT="0" distB="0" distL="0" distR="0" wp14:anchorId="574E0CD7" wp14:editId="3EB1892D">
+            <wp:extent cx="3991532" cy="1467055"/>
+            <wp:effectExtent l="19050" t="19050" r="9525" b="19050"/>
+            <wp:docPr id="14" name="Image 14"/>
+            <wp:cNvGraphicFramePr>
+              <a:graphicFrameLocks xmlns:a="http://schemas.openxmlformats.org/drawingml/2006/main" noChangeAspect="1"/>
+            </wp:cNvGraphicFramePr>
+            <a:graphic xmlns:a="http://schemas.openxmlformats.org/drawingml/2006/main">
+              <a:graphicData uri="http://schemas.openxmlformats.org/drawingml/2006/picture">
+                <pic:pic xmlns:pic="http://schemas.openxmlformats.org/drawingml/2006/picture">
+                  <pic:nvPicPr>
+                    <pic:cNvPr id="1" name=""/>
+                    <pic:cNvPicPr/>
+                  </pic:nvPicPr>
+                  <pic:blipFill>
+                    <a:blip r:embed="rId25"/>
+                    <a:stretch>
+                      <a:fillRect/>
+                    </a:stretch>
+                  </pic:blipFill>
+                  <pic:spPr>
+                    <a:xfrm>
+                      <a:off x="0" y="0"/>
+                      <a:ext cx="3991532" cy="1467055"/>
+                    </a:xfrm>
+                    <a:prstGeom prst="rect">
+                      <a:avLst/>
+                    </a:prstGeom>
+                    <a:ln>
+                      <a:solidFill>
+                        <a:schemeClr val="bg1">
+                          <a:lumMod val="75000"/>
+                        </a:schemeClr>
+                      </a:solidFill>
+                    </a:ln>
+                  </pic:spPr>
+                </pic:pic>
+              </a:graphicData>
+            </a:graphic>
+          </wp:inline>
+        </w:drawing>
+      </w:r>
+    </w:p>
+    <w:p>
+      <w:pPr>
+        <w:rPr>
+          <w:lang w:eastAsia="fr-CH"/>
+        </w:rPr>
+      </w:pPr>
+    </w:p>
+    <w:p>
+      <w:pPr>
+        <w:pStyle w:val="Titre4"/>
+        <w:rPr>
+          <w:lang w:eastAsia="fr-CH"/>
+        </w:rPr>
+      </w:pPr>
+      <w:r>
+        <w:rPr>
+          <w:lang w:eastAsia="fr-CH"/>
+        </w:rPr>
+        <w:lastRenderedPageBreak/>
+        <w:t>Recherche des utilisateurs</w:t>
+      </w:r>
+    </w:p>
+    <w:p>
+      <w:pPr>
+        <w:jc w:val="center"/>
+        <w:rPr>
+          <w:lang w:eastAsia="fr-CH"/>
+        </w:rPr>
+      </w:pPr>
+      <w:r>
+        <w:rPr>
+          <w:lang w:eastAsia="fr-CH"/>
+        </w:rPr>
+        <w:drawing>
+          <wp:inline distT="0" distB="0" distL="0" distR="0" wp14:anchorId="0BEAC20F" wp14:editId="5C3D6F59">
+            <wp:extent cx="5760720" cy="1783715"/>
+            <wp:effectExtent l="19050" t="19050" r="11430" b="26035"/>
+            <wp:docPr id="12" name="Image 12"/>
+            <wp:cNvGraphicFramePr>
+              <a:graphicFrameLocks xmlns:a="http://schemas.openxmlformats.org/drawingml/2006/main" noChangeAspect="1"/>
+            </wp:cNvGraphicFramePr>
+            <a:graphic xmlns:a="http://schemas.openxmlformats.org/drawingml/2006/main">
+              <a:graphicData uri="http://schemas.openxmlformats.org/drawingml/2006/picture">
+                <pic:pic xmlns:pic="http://schemas.openxmlformats.org/drawingml/2006/picture">
+                  <pic:nvPicPr>
+                    <pic:cNvPr id="1" name=""/>
+                    <pic:cNvPicPr/>
+                  </pic:nvPicPr>
+                  <pic:blipFill>
+                    <a:blip r:embed="rId26"/>
+                    <a:stretch>
+                      <a:fillRect/>
+                    </a:stretch>
+                  </pic:blipFill>
+                  <pic:spPr>
+                    <a:xfrm>
+                      <a:off x="0" y="0"/>
+                      <a:ext cx="5760720" cy="1783715"/>
+                    </a:xfrm>
+                    <a:prstGeom prst="rect">
+                      <a:avLst/>
+                    </a:prstGeom>
+                    <a:ln>
+                      <a:solidFill>
+                        <a:schemeClr val="bg1">
+                          <a:lumMod val="75000"/>
+                        </a:schemeClr>
+                      </a:solidFill>
+                    </a:ln>
+                  </pic:spPr>
+                </pic:pic>
+              </a:graphicData>
+            </a:graphic>
+          </wp:inline>
+        </w:drawing>
+      </w:r>
+    </w:p>
+    <w:p>
+      <w:pPr>
+        <w:rPr>
+          <w:lang w:eastAsia="fr-CH"/>
+        </w:rPr>
+      </w:pPr>
+    </w:p>
+    <w:p>
+      <w:pPr>
+        <w:pStyle w:val="Titre3"/>
+        <w:rPr>
+          <w:lang w:eastAsia="fr-CH"/>
+        </w:rPr>
+      </w:pPr>
+      <w:bookmarkStart w:id="15" w:name="_Toc192509029"/>
+      <w:r>
+        <w:rPr>
+          <w:lang w:eastAsia="fr-CH"/>
+        </w:rPr>
+        <w:t xml:space="preserve">Implémentation EJS (HTML </w:t>
+      </w:r>
+      <w:r>
+        <w:rPr>
+          <w:lang w:eastAsia="fr-CH"/>
+        </w:rPr>
+        <w:t>dynamique</w:t>
+      </w:r>
+      <w:r>
+        <w:rPr>
+          <w:lang w:eastAsia="fr-CH"/>
+        </w:rPr>
+        <w:t>)</w:t>
+      </w:r>
+      <w:bookmarkEnd w:id="15"/>
+    </w:p>
+    <w:p>
+      <w:pPr>
+        <w:rPr>
+          <w:lang w:eastAsia="fr-CH"/>
+        </w:rPr>
+      </w:pPr>
+      <w:r>
+        <w:rPr>
+          <w:lang w:eastAsia="fr-CH"/>
+        </w:rPr>
+        <w:drawing>
+          <wp:anchor distT="0" distB="0" distL="114300" distR="114300" simplePos="0" relativeHeight="251659264" behindDoc="0" locked="0" layoutInCell="1" allowOverlap="1" wp14:anchorId="03FB6532" wp14:editId="433CBD31">
+            <wp:simplePos x="0" y="0"/>
+            <wp:positionH relativeFrom="column">
+              <wp:posOffset>14605</wp:posOffset>
+            </wp:positionH>
+            <wp:positionV relativeFrom="paragraph">
+              <wp:posOffset>20955</wp:posOffset>
+            </wp:positionV>
+            <wp:extent cx="3658111" cy="1448002"/>
+            <wp:effectExtent l="19050" t="19050" r="19050" b="19050"/>
+            <wp:wrapSquare wrapText="bothSides"/>
+            <wp:docPr id="15" name="Image 15"/>
+            <wp:cNvGraphicFramePr>
+              <a:graphicFrameLocks xmlns:a="http://schemas.openxmlformats.org/drawingml/2006/main" noChangeAspect="1"/>
+            </wp:cNvGraphicFramePr>
+            <a:graphic xmlns:a="http://schemas.openxmlformats.org/drawingml/2006/main">
+              <a:graphicData uri="http://schemas.openxmlformats.org/drawingml/2006/picture">
+                <pic:pic xmlns:pic="http://schemas.openxmlformats.org/drawingml/2006/picture">
+                  <pic:nvPicPr>
+                    <pic:cNvPr id="1" name=""/>
+                    <pic:cNvPicPr/>
+                  </pic:nvPicPr>
+                  <pic:blipFill>
+                    <a:blip r:embed="rId27">
+                      <a:extLst>
+                        <a:ext uri="{28A0092B-C50C-407E-A947-70E740481C1C}">
+                          <a14:useLocalDpi xmlns:a14="http://schemas.microsoft.com/office/drawing/2010/main" val="0"/>
+                        </a:ext>
+                      </a:extLst>
+                    </a:blip>
+                    <a:stretch>
+                      <a:fillRect/>
+                    </a:stretch>
+                  </pic:blipFill>
+                  <pic:spPr>
+                    <a:xfrm>
+                      <a:off x="0" y="0"/>
+                      <a:ext cx="3658111" cy="1448002"/>
+                    </a:xfrm>
+                    <a:prstGeom prst="rect">
+                      <a:avLst/>
+                    </a:prstGeom>
+                    <a:ln>
+                      <a:solidFill>
+                        <a:schemeClr val="bg1">
+                          <a:lumMod val="75000"/>
+                        </a:schemeClr>
+                      </a:solidFill>
+                    </a:ln>
+                  </pic:spPr>
+                </pic:pic>
+              </a:graphicData>
+            </a:graphic>
+          </wp:anchor>
+        </w:drawing>
+      </w:r>
+      <w:r>
+        <w:rPr>
+          <w:lang w:eastAsia="fr-CH"/>
+        </w:rPr>
+        <w:t xml:space="preserve">Grâce à l’utilisation de </w:t>
+      </w:r>
+      <w:r>
+        <w:rPr>
+          <w:i/>
+          <w:iCs/>
+          <w:lang w:eastAsia="fr-CH"/>
+        </w:rPr>
+        <w:t>EJS</w:t>
+      </w:r>
+      <w:r>
+        <w:rPr>
+          <w:lang w:eastAsia="fr-CH"/>
+        </w:rPr>
+        <w:t>, on peut afficher les données, contenus dans la DB, sur la page de vue avec des commandes très simples et efficaces.</w:t>
+      </w:r>
+    </w:p>
+    <w:p>
+      <w:pPr>
+        <w:rPr>
+          <w:lang w:eastAsia="fr-CH"/>
+        </w:rPr>
+      </w:pPr>
+      <w:r>
+        <w:rPr>
+          <w:lang w:eastAsia="fr-CH"/>
+        </w:rPr>
+        <w:t xml:space="preserve">La configuration de </w:t>
+      </w:r>
+      <w:r>
+        <w:rPr>
+          <w:i/>
+          <w:iCs/>
+          <w:lang w:eastAsia="fr-CH"/>
+        </w:rPr>
+        <w:t>EJS</w:t>
+      </w:r>
+      <w:r>
+        <w:rPr>
+          <w:lang w:eastAsia="fr-CH"/>
+        </w:rPr>
+        <w:t xml:space="preserve"> est faite avec l’exécution des deux premiers codes ci-dessus, où on va configurer </w:t>
+      </w:r>
+      <w:r>
+        <w:rPr>
+          <w:i/>
+          <w:iCs/>
+          <w:lang w:eastAsia="fr-CH"/>
+        </w:rPr>
+        <w:t>Express</w:t>
+      </w:r>
+      <w:r>
+        <w:rPr>
+          <w:lang w:eastAsia="fr-CH"/>
+        </w:rPr>
+        <w:t xml:space="preserve"> pour utiliser </w:t>
+      </w:r>
+      <w:r>
+        <w:rPr>
+          <w:i/>
+          <w:iCs/>
+          <w:lang w:eastAsia="fr-CH"/>
+        </w:rPr>
+        <w:t>EJS</w:t>
+      </w:r>
+      <w:r>
+        <w:rPr>
+          <w:lang w:eastAsia="fr-CH"/>
+        </w:rPr>
+        <w:t xml:space="preserve"> comme moteur de </w:t>
+      </w:r>
+      <w:r>
+        <w:rPr>
+          <w:i/>
+          <w:iCs/>
+          <w:lang w:eastAsia="fr-CH"/>
+        </w:rPr>
+        <w:t>Template</w:t>
+      </w:r>
+      <w:r>
+        <w:rPr>
+          <w:lang w:eastAsia="fr-CH"/>
+        </w:rPr>
+        <w:t xml:space="preserve">. On va lui donner le chemin des fichiers </w:t>
+      </w:r>
+      <w:r>
+        <w:rPr>
+          <w:i/>
+          <w:iCs/>
+          <w:lang w:eastAsia="fr-CH"/>
+        </w:rPr>
+        <w:t>EJS</w:t>
+      </w:r>
+      <w:r>
+        <w:rPr>
+          <w:lang w:eastAsia="fr-CH"/>
+        </w:rPr>
+        <w:t xml:space="preserve"> </w:t>
+      </w:r>
+      <w:r>
+        <w:rPr>
+          <w:lang w:eastAsia="fr-CH"/>
+        </w:rPr>
+        <w:t>dans notre projet.</w:t>
+      </w:r>
+    </w:p>
+    <w:p>
+      <w:pPr>
         <w:pStyle w:val="Titre2"/>
       </w:pPr>
-      <w:bookmarkStart w:id="9" w:name="_Toc188950859"/>
+      <w:bookmarkStart w:id="16" w:name="_Toc192509030"/>
       <w:r>
         <w:lastRenderedPageBreak/>
         <w:t>Conclusion</w:t>
       </w:r>
-      <w:bookmarkEnd w:id="9"/>
+      <w:bookmarkEnd w:id="16"/>
     </w:p>
     <w:p>
       <w:pPr>
         <w:pStyle w:val="Titre3"/>
         <w:numPr>
           <w:ilvl w:val="0"/>
-          <w:numId w:val="16"/>
+          <w:numId w:val="23"/>
         </w:numPr>
         <w:rPr>
           <w:lang w:eastAsia="fr-CH"/>
         </w:rPr>
       </w:pPr>
-      <w:bookmarkStart w:id="10" w:name="_Toc188950860"/>
-      <w:r>
-        <w:rPr>
-          <w:lang w:eastAsia="fr-CH"/>
-        </w:rPr>
-        <w:t>Déroulement du projet</w:t>
-      </w:r>
-      <w:bookmarkEnd w:id="10"/>
-    </w:p>
-    <w:p>
-      <w:pPr>
-        <w:rPr>
-          <w:lang w:eastAsia="fr-CH"/>
-        </w:rPr>
-      </w:pPr>
-      <w:r>
-        <w:rPr>
-          <w:lang w:eastAsia="fr-CH"/>
-        </w:rPr>
-        <w:t>Expliquer comment le projet a déroulé, les problèmes et comment ont été résolu</w:t>
+      <w:bookmarkStart w:id="17" w:name="_Toc192509032"/>
+      <w:r>
+        <w:rPr>
+          <w:lang w:eastAsia="fr-CH"/>
+        </w:rPr>
+        <w:t>Connaissances apprises</w:t>
+      </w:r>
+      <w:bookmarkEnd w:id="17"/>
+    </w:p>
+    <w:p>
+      <w:pPr>
+        <w:pStyle w:val="Paragraphedeliste"/>
+        <w:numPr>
+          <w:ilvl w:val="0"/>
+          <w:numId w:val="21"/>
+        </w:numPr>
+        <w:rPr>
+          <w:lang w:eastAsia="fr-CH"/>
+        </w:rPr>
+      </w:pPr>
+      <w:bookmarkStart w:id="18" w:name="_Toc192509033"/>
+      <w:r>
+        <w:rPr>
+          <w:lang w:eastAsia="fr-CH"/>
+        </w:rPr>
+        <w:t xml:space="preserve">Génération et utilisation de certificats </w:t>
+      </w:r>
+      <w:r>
+        <w:rPr>
+          <w:i/>
+          <w:iCs/>
+          <w:lang w:eastAsia="fr-CH"/>
+        </w:rPr>
+        <w:t>SSL/TLS</w:t>
+      </w:r>
+      <w:r>
+        <w:rPr>
+          <w:lang w:eastAsia="fr-CH"/>
+        </w:rPr>
+        <w:t xml:space="preserve"> pour sécuriser les communications.</w:t>
+      </w:r>
+    </w:p>
+    <w:p>
+      <w:pPr>
+        <w:pStyle w:val="Paragraphedeliste"/>
+        <w:numPr>
+          <w:ilvl w:val="0"/>
+          <w:numId w:val="21"/>
+        </w:numPr>
+        <w:rPr>
+          <w:lang w:eastAsia="fr-CH"/>
+        </w:rPr>
+      </w:pPr>
+      <w:r>
+        <w:rPr>
+          <w:lang w:eastAsia="fr-CH"/>
+        </w:rPr>
+        <w:t xml:space="preserve">Hachage des mots de passe avec </w:t>
+      </w:r>
+      <w:r>
+        <w:rPr>
+          <w:i/>
+          <w:iCs/>
+          <w:lang w:eastAsia="fr-CH"/>
+        </w:rPr>
+        <w:t>bcrypt</w:t>
+      </w:r>
+      <w:r>
+        <w:rPr>
+          <w:lang w:eastAsia="fr-CH"/>
+        </w:rPr>
+        <w:t xml:space="preserve"> pour garantir la sécurité des données utilisateur.</w:t>
+      </w:r>
+    </w:p>
+    <w:p>
+      <w:pPr>
+        <w:pStyle w:val="Paragraphedeliste"/>
+        <w:numPr>
+          <w:ilvl w:val="0"/>
+          <w:numId w:val="21"/>
+        </w:numPr>
+        <w:rPr>
+          <w:lang w:eastAsia="fr-CH"/>
+        </w:rPr>
+      </w:pPr>
+      <w:r>
+        <w:rPr>
+          <w:lang w:eastAsia="fr-CH"/>
+        </w:rPr>
+        <w:t xml:space="preserve">Utilisation de </w:t>
+      </w:r>
+      <w:r>
+        <w:rPr>
+          <w:lang w:eastAsia="fr-CH"/>
+        </w:rPr>
+        <w:t>jetons</w:t>
+      </w:r>
+      <w:r>
+        <w:rPr>
+          <w:lang w:eastAsia="fr-CH"/>
+        </w:rPr>
+        <w:t xml:space="preserve"> </w:t>
+      </w:r>
+      <w:r>
+        <w:rPr>
+          <w:i/>
+          <w:iCs/>
+          <w:lang w:eastAsia="fr-CH"/>
+        </w:rPr>
+        <w:t>JWT</w:t>
+      </w:r>
+      <w:r>
+        <w:rPr>
+          <w:lang w:eastAsia="fr-CH"/>
+        </w:rPr>
+        <w:t xml:space="preserve"> pour l'authentification et la sécurisation des routes.</w:t>
+      </w:r>
+    </w:p>
+    <w:p>
+      <w:pPr>
+        <w:pStyle w:val="Paragraphedeliste"/>
+        <w:numPr>
+          <w:ilvl w:val="0"/>
+          <w:numId w:val="21"/>
+        </w:numPr>
+        <w:rPr>
+          <w:lang w:eastAsia="fr-CH"/>
+        </w:rPr>
+      </w:pPr>
+      <w:r>
+        <w:rPr>
+          <w:lang w:eastAsia="fr-CH"/>
+        </w:rPr>
+        <w:t xml:space="preserve">Création de serveurs </w:t>
+      </w:r>
+      <w:r>
+        <w:rPr>
+          <w:i/>
+          <w:iCs/>
+          <w:lang w:eastAsia="fr-CH"/>
+        </w:rPr>
+        <w:t>HTTP</w:t>
+      </w:r>
+      <w:r>
+        <w:rPr>
+          <w:lang w:eastAsia="fr-CH"/>
+        </w:rPr>
+        <w:t xml:space="preserve"> et </w:t>
+      </w:r>
+      <w:r>
+        <w:rPr>
+          <w:i/>
+          <w:iCs/>
+          <w:lang w:eastAsia="fr-CH"/>
+        </w:rPr>
+        <w:t>HTTPS</w:t>
+      </w:r>
+      <w:r>
+        <w:rPr>
+          <w:lang w:eastAsia="fr-CH"/>
+        </w:rPr>
+        <w:t xml:space="preserve"> avec </w:t>
+      </w:r>
+      <w:r>
+        <w:rPr>
+          <w:i/>
+          <w:iCs/>
+          <w:lang w:eastAsia="fr-CH"/>
+        </w:rPr>
+        <w:t>Node.js</w:t>
+      </w:r>
+      <w:r>
+        <w:rPr>
+          <w:lang w:eastAsia="fr-CH"/>
+        </w:rPr>
+        <w:t xml:space="preserve"> et </w:t>
+      </w:r>
+      <w:r>
+        <w:rPr>
+          <w:i/>
+          <w:iCs/>
+          <w:lang w:eastAsia="fr-CH"/>
+        </w:rPr>
+        <w:t>Express</w:t>
+      </w:r>
+      <w:r>
+        <w:rPr>
+          <w:lang w:eastAsia="fr-CH"/>
+        </w:rPr>
+        <w:t>.</w:t>
+      </w:r>
+    </w:p>
+    <w:p>
+      <w:pPr>
+        <w:pStyle w:val="Paragraphedeliste"/>
+        <w:numPr>
+          <w:ilvl w:val="0"/>
+          <w:numId w:val="21"/>
+        </w:numPr>
+        <w:rPr>
+          <w:lang w:eastAsia="fr-CH"/>
+        </w:rPr>
+      </w:pPr>
+      <w:r>
+        <w:rPr>
+          <w:lang w:eastAsia="fr-CH"/>
+        </w:rPr>
+        <w:t>Gestion des routes, middlewares et contrôleurs pour structurer l'application.</w:t>
+      </w:r>
+    </w:p>
+    <w:p>
+      <w:pPr>
+        <w:pStyle w:val="Paragraphedeliste"/>
+        <w:numPr>
+          <w:ilvl w:val="0"/>
+          <w:numId w:val="21"/>
+        </w:numPr>
+        <w:rPr>
+          <w:rFonts w:eastAsiaTheme="minorEastAsia" w:cstheme="minorBidi"/>
+          <w:b/>
+          <w:i/>
+          <w:color w:val="385623" w:themeColor="accent6" w:themeShade="80"/>
+          <w:sz w:val="32"/>
+          <w:lang w:eastAsia="fr-CH"/>
+        </w:rPr>
+      </w:pPr>
+      <w:r>
+        <w:rPr>
+          <w:lang w:eastAsia="fr-CH"/>
+        </w:rPr>
+        <w:t xml:space="preserve">Utilisation de modules comme </w:t>
+      </w:r>
+      <w:r>
+        <w:rPr>
+          <w:i/>
+          <w:iCs/>
+          <w:lang w:eastAsia="fr-CH"/>
+        </w:rPr>
+        <w:t>dotenv</w:t>
+      </w:r>
+      <w:r>
+        <w:rPr>
+          <w:lang w:eastAsia="fr-CH"/>
+        </w:rPr>
+        <w:t xml:space="preserve"> pour la gestion des variables d'environnement et </w:t>
+      </w:r>
+      <w:r>
+        <w:rPr>
+          <w:i/>
+          <w:iCs/>
+          <w:lang w:eastAsia="fr-CH"/>
+        </w:rPr>
+        <w:t>cookie-parser</w:t>
+      </w:r>
+      <w:r>
+        <w:rPr>
+          <w:lang w:eastAsia="fr-CH"/>
+        </w:rPr>
+        <w:t xml:space="preserve"> pour la gestion des cookies.</w:t>
       </w:r>
     </w:p>
     <w:p>
@@ -2356,60 +5257,143 @@
           <w:lang w:eastAsia="fr-CH"/>
         </w:rPr>
       </w:pPr>
-      <w:bookmarkStart w:id="11" w:name="_Toc188950861"/>
-      <w:r>
-        <w:rPr>
-          <w:lang w:eastAsia="fr-CH"/>
-        </w:rPr>
-        <w:t>Connaissances apprises</w:t>
-      </w:r>
-      <w:bookmarkEnd w:id="11"/>
-    </w:p>
-    <w:p>
-      <w:pPr>
-        <w:rPr>
-          <w:lang w:eastAsia="fr-CH"/>
-        </w:rPr>
-      </w:pPr>
-      <w:r>
-        <w:rPr>
-          <w:lang w:eastAsia="fr-CH"/>
-        </w:rPr>
-        <w:t>Donner tout ce que j’ai appris grâce au projet</w:t>
-      </w:r>
-    </w:p>
-    <w:p>
-      <w:pPr>
-        <w:pStyle w:val="Titre3"/>
-        <w:rPr>
-          <w:lang w:eastAsia="fr-CH"/>
-        </w:rPr>
-      </w:pPr>
-      <w:bookmarkStart w:id="12" w:name="_Toc188950862"/>
       <w:r>
         <w:rPr>
           <w:lang w:eastAsia="fr-CH"/>
         </w:rPr>
         <w:t>Points à améliorer</w:t>
       </w:r>
-      <w:bookmarkEnd w:id="12"/>
-    </w:p>
-    <w:p>
-      <w:pPr>
-        <w:rPr>
-          <w:lang w:eastAsia="fr-CH"/>
-        </w:rPr>
-      </w:pPr>
-      <w:r>
-        <w:rPr>
-          <w:lang w:eastAsia="fr-CH"/>
-        </w:rPr>
-        <w:t>Ce que j’ai pu améliorer si j’aurais eu plus de temps</w:t>
+      <w:bookmarkEnd w:id="18"/>
+    </w:p>
+    <w:p>
+      <w:pPr>
+        <w:pStyle w:val="Paragraphedeliste"/>
+        <w:numPr>
+          <w:ilvl w:val="0"/>
+          <w:numId w:val="22"/>
+        </w:numPr>
+        <w:rPr>
+          <w:lang w:eastAsia="fr-CH"/>
+        </w:rPr>
+      </w:pPr>
+      <w:r>
+        <w:rPr>
+          <w:lang w:eastAsia="fr-CH"/>
+        </w:rPr>
+        <w:t xml:space="preserve">Ajout de </w:t>
+      </w:r>
+      <w:r>
+        <w:rPr>
+          <w:lang w:eastAsia="fr-CH"/>
+        </w:rPr>
+        <w:t>la</w:t>
+      </w:r>
+      <w:r>
+        <w:rPr>
+          <w:lang w:eastAsia="fr-CH"/>
+        </w:rPr>
+        <w:t xml:space="preserve"> gestion des </w:t>
+      </w:r>
+      <w:r>
+        <w:rPr>
+          <w:lang w:eastAsia="fr-CH"/>
+        </w:rPr>
+        <w:t>mots de passes</w:t>
+      </w:r>
+      <w:r>
+        <w:rPr>
+          <w:lang w:eastAsia="fr-CH"/>
+        </w:rPr>
+        <w:t xml:space="preserve"> </w:t>
+      </w:r>
+      <w:r>
+        <w:rPr>
+          <w:lang w:eastAsia="fr-CH"/>
+        </w:rPr>
+        <w:t>(r</w:t>
+      </w:r>
+      <w:r>
+        <w:rPr>
+          <w:lang w:eastAsia="fr-CH"/>
+        </w:rPr>
+        <w:t xml:space="preserve">écupération </w:t>
+      </w:r>
+      <w:r>
+        <w:rPr>
+          <w:lang w:eastAsia="fr-CH"/>
+        </w:rPr>
+        <w:t>et modification)</w:t>
+      </w:r>
+      <w:r>
+        <w:rPr>
+          <w:lang w:eastAsia="fr-CH"/>
+        </w:rPr>
+        <w:t>.</w:t>
+      </w:r>
+    </w:p>
+    <w:p>
+      <w:pPr>
+        <w:pStyle w:val="Paragraphedeliste"/>
+        <w:numPr>
+          <w:ilvl w:val="0"/>
+          <w:numId w:val="22"/>
+        </w:numPr>
+        <w:rPr>
+          <w:lang w:eastAsia="fr-CH"/>
+        </w:rPr>
+      </w:pPr>
+      <w:r>
+        <w:rPr>
+          <w:lang w:eastAsia="fr-CH"/>
+        </w:rPr>
+        <w:t>Ajout de la gestion</w:t>
+      </w:r>
+      <w:r>
+        <w:rPr>
+          <w:lang w:eastAsia="fr-CH"/>
+        </w:rPr>
+        <w:t xml:space="preserve"> du nom d’utilisateur (modification).</w:t>
+      </w:r>
+    </w:p>
+    <w:p>
+      <w:pPr>
+        <w:pStyle w:val="Paragraphedeliste"/>
+        <w:numPr>
+          <w:ilvl w:val="0"/>
+          <w:numId w:val="22"/>
+        </w:numPr>
+        <w:rPr>
+          <w:lang w:eastAsia="fr-CH"/>
+        </w:rPr>
+      </w:pPr>
+      <w:r>
+        <w:rPr>
+          <w:lang w:eastAsia="fr-CH"/>
+        </w:rPr>
+        <w:t>Possibilité d’ajouter et modifier plus de données (comme date de naissance, nom, prénom, origin, etc.)</w:t>
+      </w:r>
+    </w:p>
+    <w:p>
+      <w:pPr>
+        <w:pStyle w:val="Paragraphedeliste"/>
+        <w:numPr>
+          <w:ilvl w:val="0"/>
+          <w:numId w:val="22"/>
+        </w:numPr>
+        <w:rPr>
+          <w:lang w:eastAsia="fr-CH"/>
+        </w:rPr>
+      </w:pPr>
+      <w:r>
+        <w:rPr>
+          <w:lang w:eastAsia="fr-CH"/>
+        </w:rPr>
+        <w:t>Amélioration de l'interface utilisateur pour une meilleure expérience utilisateur.</w:t>
       </w:r>
     </w:p>
     <w:sectPr>
-      <w:headerReference w:type="default" r:id="rId21"/>
-      <w:footerReference w:type="default" r:id="rId22"/>
+      <w:headerReference w:type="default" r:id="rId28"/>
+      <w:footerReference w:type="default" r:id="rId29"/>
       <w:pgSz w:w="11906" w:h="16838"/>
       <w:pgMar w:top="851" w:right="1417" w:bottom="1417" w:left="1417" w:header="708" w:footer="311" w:gutter="0"/>
       <w:pgBorders w:offsetFrom="page">
@@ -2911,6 +5895,119 @@
     </w:lvl>
   </w:abstractNum>
   <w:abstractNum w:abstractNumId="2" w15:restartNumberingAfterBreak="0">
+    <w:nsid w:val="0C234F76"/>
+    <w:multiLevelType w:val="hybridMultilevel"/>
+    <w:tmpl w:val="5A340736"/>
+    <w:lvl w:ilvl="0" w:tplc="100C0001">
+      <w:start w:val="1"/>
+      <w:numFmt w:val="bullet"/>
+      <w:lvlText w:val=""/>
+      <w:lvlJc w:val="left"/>
+      <w:pPr>
+        <w:ind w:left="720" w:hanging="360"/>
+      </w:pPr>
+      <w:rPr>
+        <w:rFonts w:ascii="Symbol" w:hAnsi="Symbol" w:hint="default"/>
+      </w:rPr>
+    </w:lvl>
+    <w:lvl w:ilvl="1" w:tplc="100C0003" w:tentative="1">
+      <w:start w:val="1"/>
+      <w:numFmt w:val="bullet"/>
+      <w:lvlText w:val="o"/>
+      <w:lvlJc w:val="left"/>
+      <w:pPr>
+        <w:ind w:left="1440" w:hanging="360"/>
+      </w:pPr>
+      <w:rPr>
+        <w:rFonts w:ascii="Courier New" w:hAnsi="Courier New" w:cs="Courier New" w:hint="default"/>
+      </w:rPr>
+    </w:lvl>
+    <w:lvl w:ilvl="2" w:tplc="100C0005" w:tentative="1">
+      <w:start w:val="1"/>
+      <w:numFmt w:val="bullet"/>
+      <w:lvlText w:val=""/>
+      <w:lvlJc w:val="left"/>
+      <w:pPr>
+        <w:ind w:left="2160" w:hanging="360"/>
+      </w:pPr>
+      <w:rPr>
+        <w:rFonts w:ascii="Wingdings" w:hAnsi="Wingdings" w:hint="default"/>
+      </w:rPr>
+    </w:lvl>
+    <w:lvl w:ilvl="3" w:tplc="100C0001" w:tentative="1">
+      <w:start w:val="1"/>
+      <w:numFmt w:val="bullet"/>
+      <w:lvlText w:val=""/>
+      <w:lvlJc w:val="left"/>
+      <w:pPr>
+        <w:ind w:left="2880" w:hanging="360"/>
+      </w:pPr>
+      <w:rPr>
+        <w:rFonts w:ascii="Symbol" w:hAnsi="Symbol" w:hint="default"/>
+      </w:rPr>
+    </w:lvl>
+    <w:lvl w:ilvl="4" w:tplc="100C0003" w:tentative="1">
+      <w:start w:val="1"/>
+      <w:numFmt w:val="bullet"/>
+      <w:lvlText w:val="o"/>
+      <w:lvlJc w:val="left"/>
+      <w:pPr>
+        <w:ind w:left="3600" w:hanging="360"/>
+      </w:pPr>
+      <w:rPr>
+        <w:rFonts w:ascii="Courier New" w:hAnsi="Courier New" w:cs="Courier New" w:hint="default"/>
+      </w:rPr>
+    </w:lvl>
+    <w:lvl w:ilvl="5" w:tplc="100C0005" w:tentative="1">
+      <w:start w:val="1"/>
+      <w:numFmt w:val="bullet"/>
+      <w:lvlText w:val=""/>
+      <w:lvlJc w:val="left"/>
+      <w:pPr>
+        <w:ind w:left="4320" w:hanging="360"/>
+      </w:pPr>
+      <w:rPr>
+        <w:rFonts w:ascii="Wingdings" w:hAnsi="Wingdings" w:hint="default"/>
+      </w:rPr>
+    </w:lvl>
+    <w:lvl w:ilvl="6" w:tplc="100C0001" w:tentative="1">
+      <w:start w:val="1"/>
+      <w:numFmt w:val="bullet"/>
+      <w:lvlText w:val=""/>
+      <w:lvlJc w:val="left"/>
+      <w:pPr>
+        <w:ind w:left="5040" w:hanging="360"/>
+      </w:pPr>
+      <w:rPr>
+        <w:rFonts w:ascii="Symbol" w:hAnsi="Symbol" w:hint="default"/>
+      </w:rPr>
+    </w:lvl>
+    <w:lvl w:ilvl="7" w:tplc="100C0003" w:tentative="1">
+      <w:start w:val="1"/>
+      <w:numFmt w:val="bullet"/>
+      <w:lvlText w:val="o"/>
+      <w:lvlJc w:val="left"/>
+      <w:pPr>
+        <w:ind w:left="5760" w:hanging="360"/>
+      </w:pPr>
+      <w:rPr>
+        <w:rFonts w:ascii="Courier New" w:hAnsi="Courier New" w:cs="Courier New" w:hint="default"/>
+      </w:rPr>
+    </w:lvl>
+    <w:lvl w:ilvl="8" w:tplc="100C0005" w:tentative="1">
+      <w:start w:val="1"/>
+      <w:numFmt w:val="bullet"/>
+      <w:lvlText w:val=""/>
+      <w:lvlJc w:val="left"/>
+      <w:pPr>
+        <w:ind w:left="6480" w:hanging="360"/>
+      </w:pPr>
+      <w:rPr>
+        <w:rFonts w:ascii="Wingdings" w:hAnsi="Wingdings" w:hint="default"/>
+      </w:rPr>
+    </w:lvl>
+  </w:abstractNum>
+  <w:abstractNum w:abstractNumId="3" w15:restartNumberingAfterBreak="0">
     <w:nsid w:val="0D2D2D1A"/>
     <w:multiLevelType w:val="hybridMultilevel"/>
     <w:tmpl w:val="3834B0D4"/>
@@ -3023,7 +6120,7 @@
       </w:rPr>
     </w:lvl>
   </w:abstractNum>
-  <w:abstractNum w:abstractNumId="3" w15:restartNumberingAfterBreak="0">
+  <w:abstractNum w:abstractNumId="4" w15:restartNumberingAfterBreak="0">
     <w:nsid w:val="0D790153"/>
     <w:multiLevelType w:val="hybridMultilevel"/>
     <w:tmpl w:val="070CD46E"/>
@@ -3110,7 +6207,7 @@
       </w:pPr>
     </w:lvl>
   </w:abstractNum>
-  <w:abstractNum w:abstractNumId="4" w15:restartNumberingAfterBreak="0">
+  <w:abstractNum w:abstractNumId="5" w15:restartNumberingAfterBreak="0">
     <w:nsid w:val="0F6434B8"/>
     <w:multiLevelType w:val="hybridMultilevel"/>
     <w:tmpl w:val="44061DAE"/>
@@ -3223,7 +6320,7 @@
       </w:rPr>
     </w:lvl>
   </w:abstractNum>
-  <w:abstractNum w:abstractNumId="5" w15:restartNumberingAfterBreak="0">
+  <w:abstractNum w:abstractNumId="6" w15:restartNumberingAfterBreak="0">
     <w:nsid w:val="1B606A14"/>
     <w:multiLevelType w:val="hybridMultilevel"/>
     <w:tmpl w:val="93E06E52"/>
@@ -3336,7 +6433,7 @@
       </w:rPr>
     </w:lvl>
   </w:abstractNum>
-  <w:abstractNum w:abstractNumId="6" w15:restartNumberingAfterBreak="0">
+  <w:abstractNum w:abstractNumId="7" w15:restartNumberingAfterBreak="0">
     <w:nsid w:val="22CB1059"/>
     <w:multiLevelType w:val="hybridMultilevel"/>
     <w:tmpl w:val="506E1A7C"/>
@@ -3449,7 +6546,7 @@
       </w:rPr>
     </w:lvl>
   </w:abstractNum>
-  <w:abstractNum w:abstractNumId="7" w15:restartNumberingAfterBreak="0">
+  <w:abstractNum w:abstractNumId="8" w15:restartNumberingAfterBreak="0">
     <w:nsid w:val="29251BDA"/>
     <w:multiLevelType w:val="hybridMultilevel"/>
     <w:tmpl w:val="4CCA3DAE"/>
@@ -3562,7 +6659,233 @@
       </w:rPr>
     </w:lvl>
   </w:abstractNum>
-  <w:abstractNum w:abstractNumId="8" w15:restartNumberingAfterBreak="0">
+  <w:abstractNum w:abstractNumId="9" w15:restartNumberingAfterBreak="0">
+    <w:nsid w:val="351811BB"/>
+    <w:multiLevelType w:val="hybridMultilevel"/>
+    <w:tmpl w:val="E41A7C62"/>
+    <w:lvl w:ilvl="0" w:tplc="100C0001">
+      <w:start w:val="1"/>
+      <w:numFmt w:val="bullet"/>
+      <w:lvlText w:val=""/>
+      <w:lvlJc w:val="left"/>
+      <w:pPr>
+        <w:ind w:left="720" w:hanging="360"/>
+      </w:pPr>
+      <w:rPr>
+        <w:rFonts w:ascii="Symbol" w:hAnsi="Symbol" w:hint="default"/>
+      </w:rPr>
+    </w:lvl>
+    <w:lvl w:ilvl="1" w:tplc="100C0003" w:tentative="1">
+      <w:start w:val="1"/>
+      <w:numFmt w:val="bullet"/>
+      <w:lvlText w:val="o"/>
+      <w:lvlJc w:val="left"/>
+      <w:pPr>
+        <w:ind w:left="1440" w:hanging="360"/>
+      </w:pPr>
+      <w:rPr>
+        <w:rFonts w:ascii="Courier New" w:hAnsi="Courier New" w:cs="Courier New" w:hint="default"/>
+      </w:rPr>
+    </w:lvl>
+    <w:lvl w:ilvl="2" w:tplc="100C0005" w:tentative="1">
+      <w:start w:val="1"/>
+      <w:numFmt w:val="bullet"/>
+      <w:lvlText w:val=""/>
+      <w:lvlJc w:val="left"/>
+      <w:pPr>
+        <w:ind w:left="2160" w:hanging="360"/>
+      </w:pPr>
+      <w:rPr>
+        <w:rFonts w:ascii="Wingdings" w:hAnsi="Wingdings" w:hint="default"/>
+      </w:rPr>
+    </w:lvl>
+    <w:lvl w:ilvl="3" w:tplc="100C0001" w:tentative="1">
+      <w:start w:val="1"/>
+      <w:numFmt w:val="bullet"/>
+      <w:lvlText w:val=""/>
+      <w:lvlJc w:val="left"/>
+      <w:pPr>
+        <w:ind w:left="2880" w:hanging="360"/>
+      </w:pPr>
+      <w:rPr>
+        <w:rFonts w:ascii="Symbol" w:hAnsi="Symbol" w:hint="default"/>
+      </w:rPr>
+    </w:lvl>
+    <w:lvl w:ilvl="4" w:tplc="100C0003" w:tentative="1">
+      <w:start w:val="1"/>
+      <w:numFmt w:val="bullet"/>
+      <w:lvlText w:val="o"/>
+      <w:lvlJc w:val="left"/>
+      <w:pPr>
+        <w:ind w:left="3600" w:hanging="360"/>
+      </w:pPr>
+      <w:rPr>
+        <w:rFonts w:ascii="Courier New" w:hAnsi="Courier New" w:cs="Courier New" w:hint="default"/>
+      </w:rPr>
+    </w:lvl>
+    <w:lvl w:ilvl="5" w:tplc="100C0005" w:tentative="1">
+      <w:start w:val="1"/>
+      <w:numFmt w:val="bullet"/>
+      <w:lvlText w:val=""/>
+      <w:lvlJc w:val="left"/>
+      <w:pPr>
+        <w:ind w:left="4320" w:hanging="360"/>
+      </w:pPr>
+      <w:rPr>
+        <w:rFonts w:ascii="Wingdings" w:hAnsi="Wingdings" w:hint="default"/>
+      </w:rPr>
+    </w:lvl>
+    <w:lvl w:ilvl="6" w:tplc="100C0001" w:tentative="1">
+      <w:start w:val="1"/>
+      <w:numFmt w:val="bullet"/>
+      <w:lvlText w:val=""/>
+      <w:lvlJc w:val="left"/>
+      <w:pPr>
+        <w:ind w:left="5040" w:hanging="360"/>
+      </w:pPr>
+      <w:rPr>
+        <w:rFonts w:ascii="Symbol" w:hAnsi="Symbol" w:hint="default"/>
+      </w:rPr>
+    </w:lvl>
+    <w:lvl w:ilvl="7" w:tplc="100C0003" w:tentative="1">
+      <w:start w:val="1"/>
+      <w:numFmt w:val="bullet"/>
+      <w:lvlText w:val="o"/>
+      <w:lvlJc w:val="left"/>
+      <w:pPr>
+        <w:ind w:left="5760" w:hanging="360"/>
+      </w:pPr>
+      <w:rPr>
+        <w:rFonts w:ascii="Courier New" w:hAnsi="Courier New" w:cs="Courier New" w:hint="default"/>
+      </w:rPr>
+    </w:lvl>
+    <w:lvl w:ilvl="8" w:tplc="100C0005" w:tentative="1">
+      <w:start w:val="1"/>
+      <w:numFmt w:val="bullet"/>
+      <w:lvlText w:val=""/>
+      <w:lvlJc w:val="left"/>
+      <w:pPr>
+        <w:ind w:left="6480" w:hanging="360"/>
+      </w:pPr>
+      <w:rPr>
+        <w:rFonts w:ascii="Wingdings" w:hAnsi="Wingdings" w:hint="default"/>
+      </w:rPr>
+    </w:lvl>
+  </w:abstractNum>
+  <w:abstractNum w:abstractNumId="10" w15:restartNumberingAfterBreak="0">
+    <w:nsid w:val="35263666"/>
+    <w:multiLevelType w:val="hybridMultilevel"/>
+    <w:tmpl w:val="C4080BA0"/>
+    <w:lvl w:ilvl="0" w:tplc="100C0001">
+      <w:start w:val="1"/>
+      <w:numFmt w:val="bullet"/>
+      <w:lvlText w:val=""/>
+      <w:lvlJc w:val="left"/>
+      <w:pPr>
+        <w:ind w:left="720" w:hanging="360"/>
+      </w:pPr>
+      <w:rPr>
+        <w:rFonts w:ascii="Symbol" w:hAnsi="Symbol" w:hint="default"/>
+      </w:rPr>
+    </w:lvl>
+    <w:lvl w:ilvl="1" w:tplc="100C0003" w:tentative="1">
+      <w:start w:val="1"/>
+      <w:numFmt w:val="bullet"/>
+      <w:lvlText w:val="o"/>
+      <w:lvlJc w:val="left"/>
+      <w:pPr>
+        <w:ind w:left="1440" w:hanging="360"/>
+      </w:pPr>
+      <w:rPr>
+        <w:rFonts w:ascii="Courier New" w:hAnsi="Courier New" w:cs="Courier New" w:hint="default"/>
+      </w:rPr>
+    </w:lvl>
+    <w:lvl w:ilvl="2" w:tplc="100C0005" w:tentative="1">
+      <w:start w:val="1"/>
+      <w:numFmt w:val="bullet"/>
+      <w:lvlText w:val=""/>
+      <w:lvlJc w:val="left"/>
+      <w:pPr>
+        <w:ind w:left="2160" w:hanging="360"/>
+      </w:pPr>
+      <w:rPr>
+        <w:rFonts w:ascii="Wingdings" w:hAnsi="Wingdings" w:hint="default"/>
+      </w:rPr>
+    </w:lvl>
+    <w:lvl w:ilvl="3" w:tplc="100C0001" w:tentative="1">
+      <w:start w:val="1"/>
+      <w:numFmt w:val="bullet"/>
+      <w:lvlText w:val=""/>
+      <w:lvlJc w:val="left"/>
+      <w:pPr>
+        <w:ind w:left="2880" w:hanging="360"/>
+      </w:pPr>
+      <w:rPr>
+        <w:rFonts w:ascii="Symbol" w:hAnsi="Symbol" w:hint="default"/>
+      </w:rPr>
+    </w:lvl>
+    <w:lvl w:ilvl="4" w:tplc="100C0003" w:tentative="1">
+      <w:start w:val="1"/>
+      <w:numFmt w:val="bullet"/>
+      <w:lvlText w:val="o"/>
+      <w:lvlJc w:val="left"/>
+      <w:pPr>
+        <w:ind w:left="3600" w:hanging="360"/>
+      </w:pPr>
+      <w:rPr>
+        <w:rFonts w:ascii="Courier New" w:hAnsi="Courier New" w:cs="Courier New" w:hint="default"/>
+      </w:rPr>
+    </w:lvl>
+    <w:lvl w:ilvl="5" w:tplc="100C0005" w:tentative="1">
+      <w:start w:val="1"/>
+      <w:numFmt w:val="bullet"/>
+      <w:lvlText w:val=""/>
+      <w:lvlJc w:val="left"/>
+      <w:pPr>
+        <w:ind w:left="4320" w:hanging="360"/>
+      </w:pPr>
+      <w:rPr>
+        <w:rFonts w:ascii="Wingdings" w:hAnsi="Wingdings" w:hint="default"/>
+      </w:rPr>
+    </w:lvl>
+    <w:lvl w:ilvl="6" w:tplc="100C0001" w:tentative="1">
+      <w:start w:val="1"/>
+      <w:numFmt w:val="bullet"/>
+      <w:lvlText w:val=""/>
+      <w:lvlJc w:val="left"/>
+      <w:pPr>
+        <w:ind w:left="5040" w:hanging="360"/>
+      </w:pPr>
+      <w:rPr>
+        <w:rFonts w:ascii="Symbol" w:hAnsi="Symbol" w:hint="default"/>
+      </w:rPr>
+    </w:lvl>
+    <w:lvl w:ilvl="7" w:tplc="100C0003" w:tentative="1">
+      <w:start w:val="1"/>
+      <w:numFmt w:val="bullet"/>
+      <w:lvlText w:val="o"/>
+      <w:lvlJc w:val="left"/>
+      <w:pPr>
+        <w:ind w:left="5760" w:hanging="360"/>
+      </w:pPr>
+      <w:rPr>
+        <w:rFonts w:ascii="Courier New" w:hAnsi="Courier New" w:cs="Courier New" w:hint="default"/>
+      </w:rPr>
+    </w:lvl>
+    <w:lvl w:ilvl="8" w:tplc="100C0005" w:tentative="1">
+      <w:start w:val="1"/>
+      <w:numFmt w:val="bullet"/>
+      <w:lvlText w:val=""/>
+      <w:lvlJc w:val="left"/>
+      <w:pPr>
+        <w:ind w:left="6480" w:hanging="360"/>
+      </w:pPr>
+      <w:rPr>
+        <w:rFonts w:ascii="Wingdings" w:hAnsi="Wingdings" w:hint="default"/>
+      </w:rPr>
+    </w:lvl>
+  </w:abstractNum>
+  <w:abstractNum w:abstractNumId="11" w15:restartNumberingAfterBreak="0">
     <w:nsid w:val="367C60B4"/>
     <w:multiLevelType w:val="hybridMultilevel"/>
     <w:tmpl w:val="23282F9E"/>
@@ -3675,7 +6998,120 @@
       </w:rPr>
     </w:lvl>
   </w:abstractNum>
-  <w:abstractNum w:abstractNumId="9" w15:restartNumberingAfterBreak="0">
+  <w:abstractNum w:abstractNumId="12" w15:restartNumberingAfterBreak="0">
+    <w:nsid w:val="38AA0E92"/>
+    <w:multiLevelType w:val="hybridMultilevel"/>
+    <w:tmpl w:val="39A4ACE6"/>
+    <w:lvl w:ilvl="0" w:tplc="100C0001">
+      <w:start w:val="1"/>
+      <w:numFmt w:val="bullet"/>
+      <w:lvlText w:val=""/>
+      <w:lvlJc w:val="left"/>
+      <w:pPr>
+        <w:ind w:left="720" w:hanging="360"/>
+      </w:pPr>
+      <w:rPr>
+        <w:rFonts w:ascii="Symbol" w:hAnsi="Symbol" w:hint="default"/>
+      </w:rPr>
+    </w:lvl>
+    <w:lvl w:ilvl="1" w:tplc="100C0003" w:tentative="1">
+      <w:start w:val="1"/>
+      <w:numFmt w:val="bullet"/>
+      <w:lvlText w:val="o"/>
+      <w:lvlJc w:val="left"/>
+      <w:pPr>
+        <w:ind w:left="1440" w:hanging="360"/>
+      </w:pPr>
+      <w:rPr>
+        <w:rFonts w:ascii="Courier New" w:hAnsi="Courier New" w:cs="Courier New" w:hint="default"/>
+      </w:rPr>
+    </w:lvl>
+    <w:lvl w:ilvl="2" w:tplc="100C0005" w:tentative="1">
+      <w:start w:val="1"/>
+      <w:numFmt w:val="bullet"/>
+      <w:lvlText w:val=""/>
+      <w:lvlJc w:val="left"/>
+      <w:pPr>
+        <w:ind w:left="2160" w:hanging="360"/>
+      </w:pPr>
+      <w:rPr>
+        <w:rFonts w:ascii="Wingdings" w:hAnsi="Wingdings" w:hint="default"/>
+      </w:rPr>
+    </w:lvl>
+    <w:lvl w:ilvl="3" w:tplc="100C0001" w:tentative="1">
+      <w:start w:val="1"/>
+      <w:numFmt w:val="bullet"/>
+      <w:lvlText w:val=""/>
+      <w:lvlJc w:val="left"/>
+      <w:pPr>
+        <w:ind w:left="2880" w:hanging="360"/>
+      </w:pPr>
+      <w:rPr>
+        <w:rFonts w:ascii="Symbol" w:hAnsi="Symbol" w:hint="default"/>
+      </w:rPr>
+    </w:lvl>
+    <w:lvl w:ilvl="4" w:tplc="100C0003" w:tentative="1">
+      <w:start w:val="1"/>
+      <w:numFmt w:val="bullet"/>
+      <w:lvlText w:val="o"/>
+      <w:lvlJc w:val="left"/>
+      <w:pPr>
+        <w:ind w:left="3600" w:hanging="360"/>
+      </w:pPr>
+      <w:rPr>
+        <w:rFonts w:ascii="Courier New" w:hAnsi="Courier New" w:cs="Courier New" w:hint="default"/>
+      </w:rPr>
+    </w:lvl>
+    <w:lvl w:ilvl="5" w:tplc="100C0005" w:tentative="1">
+      <w:start w:val="1"/>
+      <w:numFmt w:val="bullet"/>
+      <w:lvlText w:val=""/>
+      <w:lvlJc w:val="left"/>
+      <w:pPr>
+        <w:ind w:left="4320" w:hanging="360"/>
+      </w:pPr>
+      <w:rPr>
+        <w:rFonts w:ascii="Wingdings" w:hAnsi="Wingdings" w:hint="default"/>
+      </w:rPr>
+    </w:lvl>
+    <w:lvl w:ilvl="6" w:tplc="100C0001" w:tentative="1">
+      <w:start w:val="1"/>
+      <w:numFmt w:val="bullet"/>
+      <w:lvlText w:val=""/>
+      <w:lvlJc w:val="left"/>
+      <w:pPr>
+        <w:ind w:left="5040" w:hanging="360"/>
+      </w:pPr>
+      <w:rPr>
+        <w:rFonts w:ascii="Symbol" w:hAnsi="Symbol" w:hint="default"/>
+      </w:rPr>
+    </w:lvl>
+    <w:lvl w:ilvl="7" w:tplc="100C0003" w:tentative="1">
+      <w:start w:val="1"/>
+      <w:numFmt w:val="bullet"/>
+      <w:lvlText w:val="o"/>
+      <w:lvlJc w:val="left"/>
+      <w:pPr>
+        <w:ind w:left="5760" w:hanging="360"/>
+      </w:pPr>
+      <w:rPr>
+        <w:rFonts w:ascii="Courier New" w:hAnsi="Courier New" w:cs="Courier New" w:hint="default"/>
+      </w:rPr>
+    </w:lvl>
+    <w:lvl w:ilvl="8" w:tplc="100C0005" w:tentative="1">
+      <w:start w:val="1"/>
+      <w:numFmt w:val="bullet"/>
+      <w:lvlText w:val=""/>
+      <w:lvlJc w:val="left"/>
+      <w:pPr>
+        <w:ind w:left="6480" w:hanging="360"/>
+      </w:pPr>
+      <w:rPr>
+        <w:rFonts w:ascii="Wingdings" w:hAnsi="Wingdings" w:hint="default"/>
+      </w:rPr>
+    </w:lvl>
+  </w:abstractNum>
+  <w:abstractNum w:abstractNumId="13" w15:restartNumberingAfterBreak="0">
     <w:nsid w:val="3CE13266"/>
     <w:multiLevelType w:val="hybridMultilevel"/>
     <w:tmpl w:val="558EBAD8"/>
@@ -3788,7 +7224,7 @@
       </w:rPr>
     </w:lvl>
   </w:abstractNum>
-  <w:abstractNum w:abstractNumId="10" w15:restartNumberingAfterBreak="0">
+  <w:abstractNum w:abstractNumId="14" w15:restartNumberingAfterBreak="0">
     <w:nsid w:val="44DC6BC4"/>
     <w:multiLevelType w:val="hybridMultilevel"/>
     <w:tmpl w:val="0D302DD0"/>
@@ -3901,7 +7337,7 @@
       </w:rPr>
     </w:lvl>
   </w:abstractNum>
-  <w:abstractNum w:abstractNumId="11" w15:restartNumberingAfterBreak="0">
+  <w:abstractNum w:abstractNumId="15" w15:restartNumberingAfterBreak="0">
     <w:nsid w:val="462B1AE8"/>
     <w:multiLevelType w:val="hybridMultilevel"/>
     <w:tmpl w:val="D5C8E044"/>
@@ -4014,7 +7450,7 @@
       </w:rPr>
     </w:lvl>
   </w:abstractNum>
-  <w:abstractNum w:abstractNumId="12" w15:restartNumberingAfterBreak="0">
+  <w:abstractNum w:abstractNumId="16" w15:restartNumberingAfterBreak="0">
     <w:nsid w:val="56A2477F"/>
     <w:multiLevelType w:val="hybridMultilevel"/>
     <w:tmpl w:val="32928322"/>
@@ -4127,7 +7563,120 @@
       </w:rPr>
     </w:lvl>
   </w:abstractNum>
-  <w:abstractNum w:abstractNumId="13" w15:restartNumberingAfterBreak="0">
+  <w:abstractNum w:abstractNumId="17" w15:restartNumberingAfterBreak="0">
+    <w:nsid w:val="5A54132F"/>
+    <w:multiLevelType w:val="hybridMultilevel"/>
+    <w:tmpl w:val="31AE2F76"/>
+    <w:lvl w:ilvl="0" w:tplc="100C0001">
+      <w:start w:val="1"/>
+      <w:numFmt w:val="bullet"/>
+      <w:lvlText w:val=""/>
+      <w:lvlJc w:val="left"/>
+      <w:pPr>
+        <w:ind w:left="720" w:hanging="360"/>
+      </w:pPr>
+      <w:rPr>
+        <w:rFonts w:ascii="Symbol" w:hAnsi="Symbol" w:hint="default"/>
+      </w:rPr>
+    </w:lvl>
+    <w:lvl w:ilvl="1" w:tplc="100C0003" w:tentative="1">
+      <w:start w:val="1"/>
+      <w:numFmt w:val="bullet"/>
+      <w:lvlText w:val="o"/>
+      <w:lvlJc w:val="left"/>
+      <w:pPr>
+        <w:ind w:left="1440" w:hanging="360"/>
+      </w:pPr>
+      <w:rPr>
+        <w:rFonts w:ascii="Courier New" w:hAnsi="Courier New" w:cs="Courier New" w:hint="default"/>
+      </w:rPr>
+    </w:lvl>
+    <w:lvl w:ilvl="2" w:tplc="100C0005" w:tentative="1">
+      <w:start w:val="1"/>
+      <w:numFmt w:val="bullet"/>
+      <w:lvlText w:val=""/>
+      <w:lvlJc w:val="left"/>
+      <w:pPr>
+        <w:ind w:left="2160" w:hanging="360"/>
+      </w:pPr>
+      <w:rPr>
+        <w:rFonts w:ascii="Wingdings" w:hAnsi="Wingdings" w:hint="default"/>
+      </w:rPr>
+    </w:lvl>
+    <w:lvl w:ilvl="3" w:tplc="100C0001" w:tentative="1">
+      <w:start w:val="1"/>
+      <w:numFmt w:val="bullet"/>
+      <w:lvlText w:val=""/>
+      <w:lvlJc w:val="left"/>
+      <w:pPr>
+        <w:ind w:left="2880" w:hanging="360"/>
+      </w:pPr>
+      <w:rPr>
+        <w:rFonts w:ascii="Symbol" w:hAnsi="Symbol" w:hint="default"/>
+      </w:rPr>
+    </w:lvl>
+    <w:lvl w:ilvl="4" w:tplc="100C0003" w:tentative="1">
+      <w:start w:val="1"/>
+      <w:numFmt w:val="bullet"/>
+      <w:lvlText w:val="o"/>
+      <w:lvlJc w:val="left"/>
+      <w:pPr>
+        <w:ind w:left="3600" w:hanging="360"/>
+      </w:pPr>
+      <w:rPr>
+        <w:rFonts w:ascii="Courier New" w:hAnsi="Courier New" w:cs="Courier New" w:hint="default"/>
+      </w:rPr>
+    </w:lvl>
+    <w:lvl w:ilvl="5" w:tplc="100C0005" w:tentative="1">
+      <w:start w:val="1"/>
+      <w:numFmt w:val="bullet"/>
+      <w:lvlText w:val=""/>
+      <w:lvlJc w:val="left"/>
+      <w:pPr>
+        <w:ind w:left="4320" w:hanging="360"/>
+      </w:pPr>
+      <w:rPr>
+        <w:rFonts w:ascii="Wingdings" w:hAnsi="Wingdings" w:hint="default"/>
+      </w:rPr>
+    </w:lvl>
+    <w:lvl w:ilvl="6" w:tplc="100C0001" w:tentative="1">
+      <w:start w:val="1"/>
+      <w:numFmt w:val="bullet"/>
+      <w:lvlText w:val=""/>
+      <w:lvlJc w:val="left"/>
+      <w:pPr>
+        <w:ind w:left="5040" w:hanging="360"/>
+      </w:pPr>
+      <w:rPr>
+        <w:rFonts w:ascii="Symbol" w:hAnsi="Symbol" w:hint="default"/>
+      </w:rPr>
+    </w:lvl>
+    <w:lvl w:ilvl="7" w:tplc="100C0003" w:tentative="1">
+      <w:start w:val="1"/>
+      <w:numFmt w:val="bullet"/>
+      <w:lvlText w:val="o"/>
+      <w:lvlJc w:val="left"/>
+      <w:pPr>
+        <w:ind w:left="5760" w:hanging="360"/>
+      </w:pPr>
+      <w:rPr>
+        <w:rFonts w:ascii="Courier New" w:hAnsi="Courier New" w:cs="Courier New" w:hint="default"/>
+      </w:rPr>
+    </w:lvl>
+    <w:lvl w:ilvl="8" w:tplc="100C0005" w:tentative="1">
+      <w:start w:val="1"/>
+      <w:numFmt w:val="bullet"/>
+      <w:lvlText w:val=""/>
+      <w:lvlJc w:val="left"/>
+      <w:pPr>
+        <w:ind w:left="6480" w:hanging="360"/>
+      </w:pPr>
+      <w:rPr>
+        <w:rFonts w:ascii="Wingdings" w:hAnsi="Wingdings" w:hint="default"/>
+      </w:rPr>
+    </w:lvl>
+  </w:abstractNum>
+  <w:abstractNum w:abstractNumId="18" w15:restartNumberingAfterBreak="0">
     <w:nsid w:val="69C73868"/>
     <w:multiLevelType w:val="hybridMultilevel"/>
     <w:tmpl w:val="5FF6E36A"/>
@@ -4241,55 +7790,82 @@
     </w:lvl>
   </w:abstractNum>
   <w:num w:numId="1" w16cid:durableId="1306005951">
-    <w:abstractNumId w:val="3"/>
+    <w:abstractNumId w:val="4"/>
   </w:num>
   <w:num w:numId="2" w16cid:durableId="405687234">
+    <w:abstractNumId w:val="6"/>
+  </w:num>
+  <w:num w:numId="3" w16cid:durableId="1781409692">
+    <w:abstractNumId w:val="11"/>
+  </w:num>
+  <w:num w:numId="4" w16cid:durableId="1382749780">
+    <w:abstractNumId w:val="14"/>
+  </w:num>
+  <w:num w:numId="5" w16cid:durableId="1911234630">
+    <w:abstractNumId w:val="16"/>
+  </w:num>
+  <w:num w:numId="6" w16cid:durableId="1367636683">
     <w:abstractNumId w:val="5"/>
   </w:num>
-  <w:num w:numId="3" w16cid:durableId="1781409692">
-    <w:abstractNumId w:val="8"/>
-  </w:num>
-  <w:num w:numId="4" w16cid:durableId="1382749780">
-    <w:abstractNumId w:val="10"/>
-  </w:num>
-  <w:num w:numId="5" w16cid:durableId="1911234630">
-    <w:abstractNumId w:val="12"/>
-  </w:num>
-  <w:num w:numId="6" w16cid:durableId="1367636683">
-    <w:abstractNumId w:val="4"/>
-  </w:num>
   <w:num w:numId="7" w16cid:durableId="849218269">
-    <w:abstractNumId w:val="13"/>
+    <w:abstractNumId w:val="18"/>
   </w:num>
   <w:num w:numId="8" w16cid:durableId="1324165757">
-    <w:abstractNumId w:val="11"/>
+    <w:abstractNumId w:val="15"/>
   </w:num>
   <w:num w:numId="9" w16cid:durableId="391391414">
     <w:abstractNumId w:val="1"/>
   </w:num>
   <w:num w:numId="10" w16cid:durableId="1415082022">
-    <w:abstractNumId w:val="6"/>
+    <w:abstractNumId w:val="7"/>
   </w:num>
   <w:num w:numId="11" w16cid:durableId="669408099">
-    <w:abstractNumId w:val="9"/>
+    <w:abstractNumId w:val="13"/>
   </w:num>
   <w:num w:numId="12" w16cid:durableId="1753626947">
     <w:abstractNumId w:val="0"/>
   </w:num>
   <w:num w:numId="13" w16cid:durableId="1372533210">
-    <w:abstractNumId w:val="7"/>
+    <w:abstractNumId w:val="8"/>
   </w:num>
   <w:num w:numId="14" w16cid:durableId="815729941">
-    <w:abstractNumId w:val="2"/>
+    <w:abstractNumId w:val="3"/>
   </w:num>
   <w:num w:numId="15" w16cid:durableId="210532092">
-    <w:abstractNumId w:val="3"/>
+    <w:abstractNumId w:val="4"/>
     <w:lvlOverride w:ilvl="0">
       <w:startOverride w:val="1"/>
     </w:lvlOverride>
   </w:num>
   <w:num w:numId="16" w16cid:durableId="99841677">
-    <w:abstractNumId w:val="3"/>
+    <w:abstractNumId w:val="4"/>
+    <w:lvlOverride w:ilvl="0">
+      <w:startOverride w:val="1"/>
+    </w:lvlOverride>
+  </w:num>
+  <w:num w:numId="17" w16cid:durableId="1688752507">
+    <w:abstractNumId w:val="4"/>
+    <w:lvlOverride w:ilvl="0">
+      <w:startOverride w:val="1"/>
+    </w:lvlOverride>
+  </w:num>
+  <w:num w:numId="18" w16cid:durableId="826285612">
+    <w:abstractNumId w:val="10"/>
+  </w:num>
+  <w:num w:numId="19" w16cid:durableId="954873116">
+    <w:abstractNumId w:val="12"/>
+  </w:num>
+  <w:num w:numId="20" w16cid:durableId="2084981576">
+    <w:abstractNumId w:val="17"/>
+  </w:num>
+  <w:num w:numId="21" w16cid:durableId="102382009">
+    <w:abstractNumId w:val="9"/>
+  </w:num>
+  <w:num w:numId="22" w16cid:durableId="876743313">
+    <w:abstractNumId w:val="2"/>
+  </w:num>
+  <w:num w:numId="23" w16cid:durableId="577834375">
+    <w:abstractNumId w:val="4"/>
     <w:lvlOverride w:ilvl="0">
       <w:startOverride w:val="1"/>
     </w:lvlOverride>
@@ -5554,10 +9130,6 @@
 </file>
 
 <file path=customXml/item1.xml><?xml version="1.0" encoding="utf-8"?>
-<b:Sources xmlns:b="http://schemas.openxmlformats.org/officeDocument/2006/bibliography" xmlns="http://schemas.openxmlformats.org/officeDocument/2006/bibliography" SelectedStyle="\APASixthEditionOfficeOnline.xsl" StyleName="APA" Version="6"/>
-</file>
-
-<file path=customXml/item2.xml><?xml version="1.0" encoding="utf-8"?>
 <ct:contentTypeSchema xmlns:ct="http://schemas.microsoft.com/office/2006/metadata/contentType" xmlns:ma="http://schemas.microsoft.com/office/2006/metadata/properties/metaAttributes" ct:_="" ma:_="" ma:contentTypeName="Document" ma:contentTypeID="0x010100556952629042AF4392ABFF79F1535A46" ma:contentTypeVersion="14" ma:contentTypeDescription="Crée un document." ma:contentTypeScope="" ma:versionID="d7dd7aa85c7a4bea358cc70cf63b29fd">
   <xsd:schema xmlns:xsd="http://www.w3.org/2001/XMLSchema" xmlns:xs="http://www.w3.org/2001/XMLSchema" xmlns:p="http://schemas.microsoft.com/office/2006/metadata/properties" xmlns:ns3="1be71a9f-368a-4876-9c29-26a4f26a34a2" xmlns:ns4="521153c6-29d6-40b2-abdc-15687e3d4d82" targetNamespace="http://schemas.microsoft.com/office/2006/metadata/properties" ma:root="true" ma:fieldsID="b3dc5af6f139d8eb84cf72c534ecba8f" ns3:_="" ns4:_="">
     <xsd:import namespace="1be71a9f-368a-4876-9c29-26a4f26a34a2"/>
@@ -5784,7 +9356,19 @@
 </ct:contentTypeSchema>
 </file>
 
+<file path=customXml/item2.xml><?xml version="1.0" encoding="utf-8"?>
+<b:Sources xmlns:b="http://schemas.openxmlformats.org/officeDocument/2006/bibliography" xmlns="http://schemas.openxmlformats.org/officeDocument/2006/bibliography" SelectedStyle="\APASixthEditionOfficeOnline.xsl" StyleName="APA" Version="6"/>
+</file>
+
 <file path=customXml/item3.xml><?xml version="1.0" encoding="utf-8"?>
+<p:properties xmlns:p="http://schemas.microsoft.com/office/2006/metadata/properties" xmlns:xsi="http://www.w3.org/2001/XMLSchema-instance" xmlns:pc="http://schemas.microsoft.com/office/infopath/2007/PartnerControls">
+  <documentManagement>
+    <_activity xmlns="1be71a9f-368a-4876-9c29-26a4f26a34a2" xsi:nil="true"/>
+  </documentManagement>
+</p:properties>
+</file>
+
+<file path=customXml/item4.xml><?xml version="1.0" encoding="utf-8"?>
 <?mso-contentType ?>
 <FormTemplates xmlns="http://schemas.microsoft.com/sharepoint/v3/contenttype/forms">
   <Display>DocumentLibraryForm</Display>
@@ -5793,23 +9377,7 @@
 </FormTemplates>
 </file>
 
-<file path=customXml/item4.xml><?xml version="1.0" encoding="utf-8"?>
-<p:properties xmlns:p="http://schemas.microsoft.com/office/2006/metadata/properties" xmlns:xsi="http://www.w3.org/2001/XMLSchema-instance" xmlns:pc="http://schemas.microsoft.com/office/infopath/2007/PartnerControls">
-  <documentManagement>
-    <_activity xmlns="1be71a9f-368a-4876-9c29-26a4f26a34a2" xsi:nil="true"/>
-  </documentManagement>
-</p:properties>
-</file>
-
 <file path=customXml/itemProps1.xml><?xml version="1.0" encoding="utf-8"?>
-<ds:datastoreItem xmlns:ds="http://schemas.openxmlformats.org/officeDocument/2006/customXml" ds:itemID="{51574DDE-7856-40D0-B1BF-8A7AF725ADDF}">
-  <ds:schemaRefs>
-    <ds:schemaRef ds:uri="http://schemas.openxmlformats.org/officeDocument/2006/bibliography"/>
-  </ds:schemaRefs>
-</ds:datastoreItem>
-</file>
-
-<file path=customXml/itemProps2.xml><?xml version="1.0" encoding="utf-8"?>
 <ds:datastoreItem xmlns:ds="http://schemas.openxmlformats.org/officeDocument/2006/customXml" ds:itemID="{679CA638-191D-48E2-B3D7-ABC8356A9E02}">
   <ds:schemaRefs>
     <ds:schemaRef ds:uri="http://schemas.microsoft.com/office/2006/metadata/contentType"/>
@@ -5828,15 +9396,15 @@
 </ds:datastoreItem>
 </file>
 
-<file path=customXml/itemProps3.xml><?xml version="1.0" encoding="utf-8"?>
-<ds:datastoreItem xmlns:ds="http://schemas.openxmlformats.org/officeDocument/2006/customXml" ds:itemID="{D454F2B3-13D2-453B-8DFC-FDF834C4934E}">
+<file path=customXml/itemProps2.xml><?xml version="1.0" encoding="utf-8"?>
+<ds:datastoreItem xmlns:ds="http://schemas.openxmlformats.org/officeDocument/2006/customXml" ds:itemID="{51574DDE-7856-40D0-B1BF-8A7AF725ADDF}">
   <ds:schemaRefs>
-    <ds:schemaRef ds:uri="http://schemas.microsoft.com/sharepoint/v3/contenttype/forms"/>
+    <ds:schemaRef ds:uri="http://schemas.openxmlformats.org/officeDocument/2006/bibliography"/>
   </ds:schemaRefs>
 </ds:datastoreItem>
 </file>
 
-<file path=customXml/itemProps4.xml><?xml version="1.0" encoding="utf-8"?>
+<file path=customXml/itemProps3.xml><?xml version="1.0" encoding="utf-8"?>
 <ds:datastoreItem xmlns:ds="http://schemas.openxmlformats.org/officeDocument/2006/customXml" ds:itemID="{0BA2CA45-8F25-4252-8E26-C2644CB730DB}">
   <ds:schemaRefs>
     <ds:schemaRef ds:uri="http://schemas.microsoft.com/office/2006/metadata/properties"/>
@@ -5844,4 +9412,12 @@
     <ds:schemaRef ds:uri="1be71a9f-368a-4876-9c29-26a4f26a34a2"/>
   </ds:schemaRefs>
 </ds:datastoreItem>
+</file>
+
+<file path=customXml/itemProps4.xml><?xml version="1.0" encoding="utf-8"?>
+<ds:datastoreItem xmlns:ds="http://schemas.openxmlformats.org/officeDocument/2006/customXml" ds:itemID="{D454F2B3-13D2-453B-8DFC-FDF834C4934E}">
+  <ds:schemaRefs>
+    <ds:schemaRef ds:uri="http://schemas.microsoft.com/sharepoint/v3/contenttype/forms"/>
+  </ds:schemaRefs>
+</ds:datastoreItem>
 </file>
</xml_diff>